<commit_message>
commit docx file and source code
</commit_message>
<xml_diff>
--- a/Lab4_TestScript.docx
+++ b/Lab4_TestScript.docx
@@ -782,29 +782,7 @@
           <w:cs/>
           <w:lang w:bidi="th-TH"/>
         </w:rPr>
-        <w:t>ฟอร</w:t>
-      </w:r>
-      <w:proofErr w:type="spellStart"/>
-      <w:r>
-        <w:rPr>
-          <w:rFonts w:ascii="TH SarabunPSK" w:hAnsi="TH SarabunPSK" w:cs="TH SarabunPSK" w:hint="cs"/>
-          <w:sz w:val="32"/>
-          <w:szCs w:val="32"/>
-          <w:cs/>
-          <w:lang w:bidi="th-TH"/>
-        </w:rPr>
-        <w:t>์แมต</w:t>
-      </w:r>
-      <w:proofErr w:type="spellEnd"/>
-      <w:r>
-        <w:rPr>
-          <w:rFonts w:ascii="TH SarabunPSK" w:hAnsi="TH SarabunPSK" w:cs="TH SarabunPSK" w:hint="cs"/>
-          <w:sz w:val="32"/>
-          <w:szCs w:val="32"/>
-          <w:cs/>
-          <w:lang w:bidi="th-TH"/>
-        </w:rPr>
-        <w:t xml:space="preserve">ของเบอร์โทรศัพท์ที่อนุญาตให้กรอกคือ </w:t>
+        <w:t xml:space="preserve">ฟอร์แมตของเบอร์โทรศัพท์ที่อนุญาตให้กรอกคือ </w:t>
       </w:r>
       <w:r>
         <w:rPr>
@@ -1261,7 +1239,7 @@
     <w:p>
       <w:pPr>
         <w:pStyle w:val="ListParagraph"/>
-        <w:ind w:left="360"/>
+        <w:ind w:left="360" w:firstLine="360"/>
         <w:rPr>
           <w:rFonts w:ascii="TH SarabunPSK" w:hAnsi="TH SarabunPSK" w:cs="TH SarabunPSK"/>
           <w:sz w:val="32"/>
@@ -1270,33 +1248,61 @@
       </w:pPr>
       <w:r>
         <w:rPr>
-          <w:rFonts w:ascii="TH SarabunPSK" w:hAnsi="TH SarabunPSK" w:cs="TH SarabunPSK" w:hint="cs"/>
-          <w:sz w:val="32"/>
-          <w:szCs w:val="32"/>
-        </w:rPr>
-        <w:t>______________________________________________________________________________________________________________________________________________________________</w:t>
-      </w:r>
-      <w:r>
-        <w:rPr>
-          <w:rFonts w:ascii="TH SarabunPSK" w:hAnsi="TH SarabunPSK" w:cs="TH SarabunPSK" w:hint="cs"/>
-          <w:sz w:val="32"/>
-          <w:szCs w:val="32"/>
-        </w:rPr>
-        <w:lastRenderedPageBreak/>
-        <w:t>______________________________________________________________________________________________________________________________________________________________</w:t>
+          <w:rFonts w:ascii="TH SarabunPSK" w:hAnsi="TH SarabunPSK" w:cs="TH SarabunPSK"/>
+          <w:sz w:val="32"/>
+          <w:szCs w:val="32"/>
+        </w:rPr>
+        <w:t>CPU : AMD Ryzen 5 Mobile 4600H</w:t>
       </w:r>
     </w:p>
     <w:p>
       <w:pPr>
         <w:pStyle w:val="ListParagraph"/>
+        <w:ind w:left="360" w:firstLine="360"/>
+        <w:rPr>
+          <w:rFonts w:ascii="TH SarabunPSK" w:hAnsi="TH SarabunPSK" w:cs="TH SarabunPSK"/>
+          <w:sz w:val="32"/>
+          <w:szCs w:val="32"/>
+        </w:rPr>
+      </w:pPr>
+      <w:r>
+        <w:rPr>
+          <w:rFonts w:ascii="TH SarabunPSK" w:hAnsi="TH SarabunPSK" w:cs="TH SarabunPSK"/>
+          <w:sz w:val="32"/>
+          <w:szCs w:val="32"/>
+        </w:rPr>
+        <w:t xml:space="preserve">Memory : DDR4-3200 (1600MHz), Size: 8 </w:t>
+      </w:r>
+      <w:proofErr w:type="spellStart"/>
+      <w:r>
+        <w:rPr>
+          <w:rFonts w:ascii="TH SarabunPSK" w:hAnsi="TH SarabunPSK" w:cs="TH SarabunPSK"/>
+          <w:sz w:val="32"/>
+          <w:szCs w:val="32"/>
+        </w:rPr>
+        <w:t>GBytes</w:t>
+      </w:r>
+      <w:proofErr w:type="spellEnd"/>
+    </w:p>
+    <w:p>
+      <w:pPr>
+        <w:pStyle w:val="ListParagraph"/>
         <w:spacing w:before="240" w:line="240" w:lineRule="auto"/>
-        <w:ind w:left="357"/>
+        <w:ind w:left="357" w:firstLine="363"/>
         <w:rPr>
           <w:rFonts w:ascii="TH SarabunPSK" w:hAnsi="TH SarabunPSK" w:cs="TH SarabunPSK"/>
           <w:sz w:val="32"/>
           <w:szCs w:val="32"/>
         </w:rPr>
       </w:pPr>
+      <w:r>
+        <w:rPr>
+          <w:rFonts w:ascii="TH SarabunPSK" w:hAnsi="TH SarabunPSK" w:cs="TH SarabunPSK"/>
+          <w:sz w:val="32"/>
+          <w:szCs w:val="32"/>
+        </w:rPr>
+        <w:t>Graphics : NVIDIA GeForce GTX 1650</w:t>
+      </w:r>
     </w:p>
     <w:p>
       <w:pPr>
@@ -1316,6 +1322,7 @@
           <w:sz w:val="32"/>
           <w:szCs w:val="32"/>
         </w:rPr>
+        <w:lastRenderedPageBreak/>
         <w:t>3</w:t>
       </w:r>
       <w:r>
@@ -1368,7 +1375,7 @@
     <w:p>
       <w:pPr>
         <w:pStyle w:val="ListParagraph"/>
-        <w:ind w:left="360"/>
+        <w:ind w:left="360" w:firstLine="360"/>
         <w:rPr>
           <w:rFonts w:ascii="TH SarabunPSK" w:hAnsi="TH SarabunPSK" w:cs="TH SarabunPSK"/>
           <w:sz w:val="32"/>
@@ -1378,12 +1385,66 @@
       </w:pPr>
       <w:r>
         <w:rPr>
-          <w:rFonts w:ascii="TH SarabunPSK" w:hAnsi="TH SarabunPSK" w:cs="TH SarabunPSK" w:hint="cs"/>
+          <w:rFonts w:ascii="TH SarabunPSK" w:hAnsi="TH SarabunPSK" w:cs="TH SarabunPSK"/>
           <w:sz w:val="32"/>
           <w:szCs w:val="32"/>
           <w:lang w:bidi="th-TH"/>
         </w:rPr>
-        <w:t>___________________________________________________________________________________________________________________________________________________________________________________________________________________________________________________________________________________________________________________________________________________________________________________________________________</w:t>
+        <w:t>V</w:t>
+      </w:r>
+      <w:r>
+        <w:rPr>
+          <w:rFonts w:ascii="TH SarabunPSK" w:hAnsi="TH SarabunPSK" w:cs="TH SarabunPSK"/>
+          <w:sz w:val="32"/>
+          <w:szCs w:val="32"/>
+          <w:lang w:bidi="th-TH"/>
+        </w:rPr>
+        <w:t xml:space="preserve">isual </w:t>
+      </w:r>
+      <w:r>
+        <w:rPr>
+          <w:rFonts w:ascii="TH SarabunPSK" w:hAnsi="TH SarabunPSK" w:cs="TH SarabunPSK"/>
+          <w:sz w:val="32"/>
+          <w:szCs w:val="32"/>
+          <w:lang w:bidi="th-TH"/>
+        </w:rPr>
+        <w:t>S</w:t>
+      </w:r>
+      <w:r>
+        <w:rPr>
+          <w:rFonts w:ascii="TH SarabunPSK" w:hAnsi="TH SarabunPSK" w:cs="TH SarabunPSK"/>
+          <w:sz w:val="32"/>
+          <w:szCs w:val="32"/>
+          <w:lang w:bidi="th-TH"/>
+        </w:rPr>
+        <w:t xml:space="preserve">tudio </w:t>
+      </w:r>
+      <w:r>
+        <w:rPr>
+          <w:rFonts w:ascii="TH SarabunPSK" w:hAnsi="TH SarabunPSK" w:cs="TH SarabunPSK"/>
+          <w:sz w:val="32"/>
+          <w:szCs w:val="32"/>
+          <w:lang w:bidi="th-TH"/>
+        </w:rPr>
+        <w:t>C</w:t>
+      </w:r>
+      <w:r>
+        <w:rPr>
+          <w:rFonts w:ascii="TH SarabunPSK" w:hAnsi="TH SarabunPSK" w:cs="TH SarabunPSK"/>
+          <w:sz w:val="32"/>
+          <w:szCs w:val="32"/>
+          <w:lang w:bidi="th-TH"/>
+        </w:rPr>
+        <w:t>ode</w:t>
+      </w:r>
+      <w:r>
+        <w:rPr>
+          <w:rFonts w:ascii="TH SarabunPSK" w:hAnsi="TH SarabunPSK" w:cs="TH SarabunPSK"/>
+          <w:sz w:val="32"/>
+          <w:szCs w:val="32"/>
+          <w:lang w:bidi="th-TH"/>
+        </w:rPr>
+        <w:t>, Chrome</w:t>
       </w:r>
     </w:p>
     <w:p>
@@ -1458,7 +1519,7 @@
     <w:p>
       <w:pPr>
         <w:pStyle w:val="ListParagraph"/>
-        <w:ind w:left="360"/>
+        <w:ind w:left="360" w:firstLine="360"/>
         <w:rPr>
           <w:rFonts w:ascii="TH SarabunPSK" w:hAnsi="TH SarabunPSK" w:cs="TH SarabunPSK"/>
           <w:sz w:val="32"/>
@@ -1470,9 +1531,19 @@
           <w:rFonts w:ascii="TH SarabunPSK" w:hAnsi="TH SarabunPSK" w:cs="TH SarabunPSK" w:hint="cs"/>
           <w:sz w:val="32"/>
           <w:szCs w:val="32"/>
+          <w:cs/>
           <w:lang w:bidi="th-TH"/>
         </w:rPr>
-        <w:t>_____________________________________________________________________________________________________________________________________________________________________________________________________________________________________________</w:t>
+        <w:t xml:space="preserve">นายศุภวิชญ์ ศักดิ์เทวินทร์ 663380239-8 </w:t>
+      </w:r>
+      <w:r>
+        <w:rPr>
+          <w:rFonts w:ascii="TH SarabunPSK" w:hAnsi="TH SarabunPSK" w:cs="TH SarabunPSK"/>
+          <w:sz w:val="32"/>
+          <w:szCs w:val="32"/>
+          <w:lang w:bidi="th-TH"/>
+        </w:rPr>
+        <w:t>Sec.1</w:t>
       </w:r>
     </w:p>
     <w:p>
@@ -1919,7 +1990,7 @@
     <w:p>
       <w:pPr>
         <w:rPr>
-          <w:rFonts w:ascii="TH SarabunPSK" w:hAnsi="TH SarabunPSK" w:cs="TH SarabunPSK" w:hint="cs"/>
+          <w:rFonts w:ascii="TH SarabunPSK" w:hAnsi="TH SarabunPSK" w:cs="TH SarabunPSK"/>
           <w:sz w:val="32"/>
           <w:szCs w:val="32"/>
           <w:lang w:bidi="th-TH"/>
@@ -1997,7 +2068,6 @@
                 <w:szCs w:val="32"/>
                 <w:lang w:bidi="th-TH"/>
               </w:rPr>
-              <w:lastRenderedPageBreak/>
               <w:t>Test Scenario ID</w:t>
             </w:r>
             <w:r>
@@ -2275,17 +2345,7 @@
                 <w:cs/>
                 <w:lang w:bidi="th-TH"/>
               </w:rPr>
-              <w:t>อบรมเชิงปฏิบั</w:t>
-            </w:r>
-            <w:r>
-              <w:rPr>
-                <w:rFonts w:ascii="TH SarabunPSK" w:hAnsi="TH SarabunPSK" w:cs="TH SarabunPSK" w:hint="cs"/>
-                <w:sz w:val="32"/>
-                <w:szCs w:val="32"/>
-                <w:cs/>
-                <w:lang w:bidi="th-TH"/>
-              </w:rPr>
-              <w:t>ติการ</w:t>
+              <w:t>อบรมเชิงปฏิบัติการ</w:t>
             </w:r>
             <w:r>
               <w:rPr>
@@ -2350,9 +2410,20 @@
                 <w:rFonts w:ascii="TH SarabunPSK" w:hAnsi="TH SarabunPSK" w:cs="TH SarabunPSK"/>
                 <w:sz w:val="32"/>
                 <w:szCs w:val="32"/>
-                <w:lang w:bidi="th-TH"/>
-              </w:rPr>
-            </w:pPr>
+                <w:cs/>
+                <w:lang w:bidi="th-TH"/>
+              </w:rPr>
+            </w:pPr>
+            <w:r>
+              <w:rPr>
+                <w:rFonts w:ascii="TH SarabunPSK" w:hAnsi="TH SarabunPSK" w:cs="TH SarabunPSK" w:hint="cs"/>
+                <w:sz w:val="32"/>
+                <w:szCs w:val="32"/>
+                <w:cs/>
+                <w:lang w:bidi="th-TH"/>
+              </w:rPr>
+              <w:t>ศุภวิชญ์ ศักดิ์เทวินทร์</w:t>
+            </w:r>
           </w:p>
         </w:tc>
       </w:tr>
@@ -2717,6 +2788,15 @@
                 <w:lang w:bidi="th-TH"/>
               </w:rPr>
             </w:pPr>
+            <w:r>
+              <w:rPr>
+                <w:rFonts w:ascii="TH SarabunPSK" w:hAnsi="TH SarabunPSK" w:cs="TH SarabunPSK"/>
+                <w:sz w:val="32"/>
+                <w:szCs w:val="32"/>
+                <w:lang w:bidi="th-TH"/>
+              </w:rPr>
+              <w:t>30/12/2568</w:t>
+            </w:r>
           </w:p>
         </w:tc>
       </w:tr>
@@ -3815,6 +3895,44 @@
                 <w:lang w:bidi="th-TH"/>
               </w:rPr>
             </w:pPr>
+            <w:r>
+              <w:rPr>
+                <w:rFonts w:ascii="TH SarabunPSK" w:hAnsi="TH SarabunPSK" w:cs="TH SarabunPSK" w:hint="cs"/>
+                <w:sz w:val="32"/>
+                <w:szCs w:val="32"/>
+                <w:cs/>
+                <w:lang w:bidi="th-TH"/>
+              </w:rPr>
+              <w:t xml:space="preserve">แสดงหน้า </w:t>
+            </w:r>
+            <w:r>
+              <w:rPr>
+                <w:rFonts w:ascii="TH SarabunPSK" w:hAnsi="TH SarabunPSK" w:cs="TH SarabunPSK"/>
+                <w:sz w:val="32"/>
+                <w:szCs w:val="32"/>
+                <w:lang w:bidi="th-TH"/>
+              </w:rPr>
+              <w:t>Workshop</w:t>
+            </w:r>
+            <w:r>
+              <w:rPr>
+                <w:rFonts w:ascii="TH SarabunPSK" w:hAnsi="TH SarabunPSK" w:cs="TH SarabunPSK" w:hint="cs"/>
+                <w:sz w:val="32"/>
+                <w:szCs w:val="32"/>
+                <w:cs/>
+                <w:lang w:bidi="th-TH"/>
+              </w:rPr>
+              <w:t xml:space="preserve"> </w:t>
+            </w:r>
+            <w:r>
+              <w:rPr>
+                <w:rFonts w:ascii="TH SarabunPSK" w:hAnsi="TH SarabunPSK" w:cs="TH SarabunPSK" w:hint="cs"/>
+                <w:sz w:val="32"/>
+                <w:szCs w:val="32"/>
+                <w:lang w:bidi="th-TH"/>
+              </w:rPr>
+              <w:t>Registration</w:t>
+            </w:r>
           </w:p>
         </w:tc>
         <w:tc>
@@ -3823,13 +3941,64 @@
           </w:tcPr>
           <w:p>
             <w:pPr>
-              <w:rPr>
-                <w:rFonts w:ascii="TH SarabunPSK" w:hAnsi="TH SarabunPSK" w:cs="TH SarabunPSK"/>
-                <w:sz w:val="32"/>
-                <w:szCs w:val="32"/>
-                <w:lang w:bidi="th-TH"/>
-              </w:rPr>
-            </w:pPr>
+              <w:jc w:val="center"/>
+              <w:rPr>
+                <w:rFonts w:ascii="TH SarabunPSK" w:hAnsi="TH SarabunPSK" w:cs="TH SarabunPSK"/>
+                <w:sz w:val="32"/>
+                <w:szCs w:val="32"/>
+                <w:lang w:bidi="th-TH"/>
+              </w:rPr>
+            </w:pPr>
+            <w:r>
+              <w:rPr>
+                <w:rFonts w:ascii="TH SarabunPSK" w:hAnsi="TH SarabunPSK" w:cs="TH SarabunPSK" w:hint="cs"/>
+                <w:noProof/>
+                <w:sz w:val="32"/>
+                <w:szCs w:val="32"/>
+                <w:lang w:bidi="th-TH"/>
+              </w:rPr>
+              <w:drawing>
+                <wp:inline distT="0" distB="0" distL="0" distR="0" wp14:anchorId="7F01D2CB" wp14:editId="0400C4CA">
+                  <wp:extent cx="201761" cy="191069"/>
+                  <wp:effectExtent l="0" t="0" r="8255" b="0"/>
+                  <wp:docPr id="984506663" name="Picture 984506663"/>
+                  <wp:cNvGraphicFramePr>
+                    <a:graphicFrameLocks xmlns:a="http://schemas.openxmlformats.org/drawingml/2006/main" noChangeAspect="1"/>
+                  </wp:cNvGraphicFramePr>
+                  <a:graphic xmlns:a="http://schemas.openxmlformats.org/drawingml/2006/main">
+                    <a:graphicData uri="http://schemas.openxmlformats.org/drawingml/2006/picture">
+                      <pic:pic xmlns:pic="http://schemas.openxmlformats.org/drawingml/2006/picture">
+                        <pic:nvPicPr>
+                          <pic:cNvPr id="1" name="th[1].png"/>
+                          <pic:cNvPicPr/>
+                        </pic:nvPicPr>
+                        <pic:blipFill>
+                          <a:blip r:embed="rId8" cstate="print">
+                            <a:extLst>
+                              <a:ext uri="{28A0092B-C50C-407E-A947-70E740481C1C}">
+                                <a14:useLocalDpi xmlns:a14="http://schemas.microsoft.com/office/drawing/2010/main" val="0"/>
+                              </a:ext>
+                            </a:extLst>
+                          </a:blip>
+                          <a:stretch>
+                            <a:fillRect/>
+                          </a:stretch>
+                        </pic:blipFill>
+                        <pic:spPr>
+                          <a:xfrm>
+                            <a:off x="0" y="0"/>
+                            <a:ext cx="214886" cy="203498"/>
+                          </a:xfrm>
+                          <a:prstGeom prst="rect">
+                            <a:avLst/>
+                          </a:prstGeom>
+                        </pic:spPr>
+                      </pic:pic>
+                    </a:graphicData>
+                  </a:graphic>
+                </wp:inline>
+              </w:drawing>
+            </w:r>
           </w:p>
         </w:tc>
         <w:tc>
@@ -4728,6 +4897,130 @@
                 <w:lang w:bidi="th-TH"/>
               </w:rPr>
             </w:pPr>
+            <w:r>
+              <w:rPr>
+                <w:rFonts w:ascii="TH SarabunPSK" w:hAnsi="TH SarabunPSK" w:cs="TH SarabunPSK" w:hint="cs"/>
+                <w:sz w:val="32"/>
+                <w:szCs w:val="32"/>
+                <w:cs/>
+                <w:lang w:bidi="th-TH"/>
+              </w:rPr>
+              <w:t xml:space="preserve">แสดงหน้า </w:t>
+            </w:r>
+            <w:r>
+              <w:rPr>
+                <w:rFonts w:ascii="TH SarabunPSK" w:hAnsi="TH SarabunPSK" w:cs="TH SarabunPSK" w:hint="cs"/>
+                <w:sz w:val="32"/>
+                <w:szCs w:val="32"/>
+                <w:lang w:bidi="th-TH"/>
+              </w:rPr>
+              <w:t>Success</w:t>
+            </w:r>
+            <w:r>
+              <w:rPr>
+                <w:rFonts w:ascii="TH SarabunPSK" w:hAnsi="TH SarabunPSK" w:cs="TH SarabunPSK" w:hint="cs"/>
+                <w:sz w:val="32"/>
+                <w:szCs w:val="32"/>
+                <w:cs/>
+                <w:lang w:bidi="th-TH"/>
+              </w:rPr>
+              <w:t>.</w:t>
+            </w:r>
+            <w:r>
+              <w:rPr>
+                <w:rFonts w:ascii="TH SarabunPSK" w:hAnsi="TH SarabunPSK" w:cs="TH SarabunPSK" w:hint="cs"/>
+                <w:sz w:val="32"/>
+                <w:szCs w:val="32"/>
+                <w:lang w:bidi="th-TH"/>
+              </w:rPr>
+              <w:t xml:space="preserve">html </w:t>
+            </w:r>
+            <w:r>
+              <w:rPr>
+                <w:rFonts w:ascii="TH SarabunPSK" w:hAnsi="TH SarabunPSK" w:cs="TH SarabunPSK" w:hint="cs"/>
+                <w:sz w:val="32"/>
+                <w:szCs w:val="32"/>
+                <w:cs/>
+                <w:lang w:bidi="th-TH"/>
+              </w:rPr>
+              <w:t xml:space="preserve">โดยมี </w:t>
+            </w:r>
+            <w:r>
+              <w:rPr>
+                <w:rFonts w:ascii="TH SarabunPSK" w:hAnsi="TH SarabunPSK" w:cs="TH SarabunPSK" w:hint="cs"/>
+                <w:sz w:val="32"/>
+                <w:szCs w:val="32"/>
+                <w:lang w:bidi="th-TH"/>
+              </w:rPr>
+              <w:t xml:space="preserve">Title </w:t>
+            </w:r>
+            <w:r>
+              <w:rPr>
+                <w:rFonts w:ascii="TH SarabunPSK" w:hAnsi="TH SarabunPSK" w:cs="TH SarabunPSK" w:hint="cs"/>
+                <w:sz w:val="32"/>
+                <w:szCs w:val="32"/>
+                <w:cs/>
+                <w:lang w:bidi="th-TH"/>
+              </w:rPr>
+              <w:t>เป็น “</w:t>
+            </w:r>
+            <w:r>
+              <w:rPr>
+                <w:rFonts w:ascii="TH SarabunPSK" w:hAnsi="TH SarabunPSK" w:cs="TH SarabunPSK" w:hint="cs"/>
+                <w:sz w:val="32"/>
+                <w:szCs w:val="32"/>
+                <w:lang w:bidi="th-TH"/>
+              </w:rPr>
+              <w:t>Success</w:t>
+            </w:r>
+            <w:r>
+              <w:rPr>
+                <w:rFonts w:ascii="TH SarabunPSK" w:hAnsi="TH SarabunPSK" w:cs="TH SarabunPSK" w:hint="cs"/>
+                <w:sz w:val="32"/>
+                <w:szCs w:val="32"/>
+                <w:cs/>
+                <w:lang w:bidi="th-TH"/>
+              </w:rPr>
+              <w:t>” และแสดงข้อความ “</w:t>
+            </w:r>
+            <w:r>
+              <w:rPr>
+                <w:rFonts w:ascii="TH SarabunPSK" w:hAnsi="TH SarabunPSK" w:cs="TH SarabunPSK"/>
+                <w:sz w:val="32"/>
+                <w:szCs w:val="32"/>
+                <w:lang w:bidi="th-TH"/>
+              </w:rPr>
+              <w:t>Thank you for registering with us.</w:t>
+            </w:r>
+            <w:r>
+              <w:rPr>
+                <w:rFonts w:ascii="TH SarabunPSK" w:hAnsi="TH SarabunPSK" w:cs="TH SarabunPSK" w:hint="cs"/>
+                <w:sz w:val="32"/>
+                <w:szCs w:val="32"/>
+                <w:cs/>
+                <w:lang w:bidi="th-TH"/>
+              </w:rPr>
+              <w:t>” และ “</w:t>
+            </w:r>
+            <w:r>
+              <w:rPr>
+                <w:rFonts w:ascii="TH SarabunPSK" w:hAnsi="TH SarabunPSK" w:cs="TH SarabunPSK"/>
+                <w:sz w:val="32"/>
+                <w:szCs w:val="32"/>
+                <w:lang w:bidi="th-TH"/>
+              </w:rPr>
+              <w:t>We will send a confirmation to your email soon.</w:t>
+            </w:r>
+            <w:r>
+              <w:rPr>
+                <w:rFonts w:ascii="TH SarabunPSK" w:hAnsi="TH SarabunPSK" w:cs="TH SarabunPSK" w:hint="cs"/>
+                <w:sz w:val="32"/>
+                <w:szCs w:val="32"/>
+                <w:cs/>
+                <w:lang w:bidi="th-TH"/>
+              </w:rPr>
+              <w:t>”</w:t>
+            </w:r>
           </w:p>
         </w:tc>
         <w:tc>
@@ -4736,13 +5029,64 @@
           </w:tcPr>
           <w:p>
             <w:pPr>
-              <w:rPr>
-                <w:rFonts w:ascii="TH SarabunPSK" w:hAnsi="TH SarabunPSK" w:cs="TH SarabunPSK"/>
-                <w:sz w:val="32"/>
-                <w:szCs w:val="32"/>
-                <w:lang w:bidi="th-TH"/>
-              </w:rPr>
-            </w:pPr>
+              <w:jc w:val="center"/>
+              <w:rPr>
+                <w:rFonts w:ascii="TH SarabunPSK" w:hAnsi="TH SarabunPSK" w:cs="TH SarabunPSK"/>
+                <w:sz w:val="32"/>
+                <w:szCs w:val="32"/>
+                <w:lang w:bidi="th-TH"/>
+              </w:rPr>
+            </w:pPr>
+            <w:r>
+              <w:rPr>
+                <w:rFonts w:ascii="TH SarabunPSK" w:hAnsi="TH SarabunPSK" w:cs="TH SarabunPSK" w:hint="cs"/>
+                <w:noProof/>
+                <w:sz w:val="32"/>
+                <w:szCs w:val="32"/>
+                <w:lang w:bidi="th-TH"/>
+              </w:rPr>
+              <w:drawing>
+                <wp:inline distT="0" distB="0" distL="0" distR="0" wp14:anchorId="00C03E06" wp14:editId="6A181C5B">
+                  <wp:extent cx="201761" cy="191069"/>
+                  <wp:effectExtent l="0" t="0" r="8255" b="0"/>
+                  <wp:docPr id="1723483249" name="Picture 1723483249"/>
+                  <wp:cNvGraphicFramePr>
+                    <a:graphicFrameLocks xmlns:a="http://schemas.openxmlformats.org/drawingml/2006/main" noChangeAspect="1"/>
+                  </wp:cNvGraphicFramePr>
+                  <a:graphic xmlns:a="http://schemas.openxmlformats.org/drawingml/2006/main">
+                    <a:graphicData uri="http://schemas.openxmlformats.org/drawingml/2006/picture">
+                      <pic:pic xmlns:pic="http://schemas.openxmlformats.org/drawingml/2006/picture">
+                        <pic:nvPicPr>
+                          <pic:cNvPr id="1" name="th[1].png"/>
+                          <pic:cNvPicPr/>
+                        </pic:nvPicPr>
+                        <pic:blipFill>
+                          <a:blip r:embed="rId8" cstate="print">
+                            <a:extLst>
+                              <a:ext uri="{28A0092B-C50C-407E-A947-70E740481C1C}">
+                                <a14:useLocalDpi xmlns:a14="http://schemas.microsoft.com/office/drawing/2010/main" val="0"/>
+                              </a:ext>
+                            </a:extLst>
+                          </a:blip>
+                          <a:stretch>
+                            <a:fillRect/>
+                          </a:stretch>
+                        </pic:blipFill>
+                        <pic:spPr>
+                          <a:xfrm>
+                            <a:off x="0" y="0"/>
+                            <a:ext cx="214886" cy="203498"/>
+                          </a:xfrm>
+                          <a:prstGeom prst="rect">
+                            <a:avLst/>
+                          </a:prstGeom>
+                        </pic:spPr>
+                      </pic:pic>
+                    </a:graphicData>
+                  </a:graphic>
+                </wp:inline>
+              </w:drawing>
+            </w:r>
           </w:p>
         </w:tc>
         <w:tc>
@@ -4787,7 +5131,6 @@
                 <w:szCs w:val="32"/>
                 <w:lang w:bidi="th-TH"/>
               </w:rPr>
-              <w:lastRenderedPageBreak/>
               <w:t>No</w:t>
             </w:r>
             <w:r>
@@ -5298,6 +5641,43 @@
                 <w:lang w:bidi="th-TH"/>
               </w:rPr>
             </w:pPr>
+            <w:r>
+              <w:rPr>
+                <w:rFonts w:ascii="TH SarabunPSK" w:hAnsi="TH SarabunPSK" w:cs="TH SarabunPSK" w:hint="cs"/>
+                <w:sz w:val="32"/>
+                <w:szCs w:val="32"/>
+                <w:cs/>
+                <w:lang w:bidi="th-TH"/>
+              </w:rPr>
+              <w:t>แสดงหน้า</w:t>
+            </w:r>
+            <w:r>
+              <w:rPr>
+                <w:rFonts w:ascii="TH SarabunPSK" w:hAnsi="TH SarabunPSK" w:cs="TH SarabunPSK" w:hint="cs"/>
+                <w:sz w:val="32"/>
+                <w:szCs w:val="32"/>
+                <w:lang w:bidi="th-TH"/>
+              </w:rPr>
+              <w:t xml:space="preserve"> </w:t>
+            </w:r>
+            <w:r>
+              <w:rPr>
+                <w:rFonts w:ascii="TH SarabunPSK" w:hAnsi="TH SarabunPSK" w:cs="TH SarabunPSK"/>
+                <w:sz w:val="32"/>
+                <w:szCs w:val="32"/>
+                <w:lang w:bidi="th-TH"/>
+              </w:rPr>
+              <w:t>Workshop</w:t>
+            </w:r>
+            <w:r>
+              <w:rPr>
+                <w:rFonts w:ascii="TH SarabunPSK" w:hAnsi="TH SarabunPSK" w:cs="TH SarabunPSK" w:hint="cs"/>
+                <w:sz w:val="32"/>
+                <w:szCs w:val="32"/>
+                <w:lang w:bidi="th-TH"/>
+              </w:rPr>
+              <w:t xml:space="preserve"> Registration</w:t>
+            </w:r>
           </w:p>
         </w:tc>
         <w:tc>
@@ -5306,13 +5686,64 @@
           </w:tcPr>
           <w:p>
             <w:pPr>
-              <w:rPr>
-                <w:rFonts w:ascii="TH SarabunPSK" w:hAnsi="TH SarabunPSK" w:cs="TH SarabunPSK"/>
-                <w:sz w:val="32"/>
-                <w:szCs w:val="32"/>
-                <w:lang w:bidi="th-TH"/>
-              </w:rPr>
-            </w:pPr>
+              <w:jc w:val="center"/>
+              <w:rPr>
+                <w:rFonts w:ascii="TH SarabunPSK" w:hAnsi="TH SarabunPSK" w:cs="TH SarabunPSK"/>
+                <w:sz w:val="32"/>
+                <w:szCs w:val="32"/>
+                <w:lang w:bidi="th-TH"/>
+              </w:rPr>
+            </w:pPr>
+            <w:r>
+              <w:rPr>
+                <w:rFonts w:ascii="TH SarabunPSK" w:hAnsi="TH SarabunPSK" w:cs="TH SarabunPSK" w:hint="cs"/>
+                <w:noProof/>
+                <w:sz w:val="32"/>
+                <w:szCs w:val="32"/>
+                <w:lang w:bidi="th-TH"/>
+              </w:rPr>
+              <w:drawing>
+                <wp:inline distT="0" distB="0" distL="0" distR="0" wp14:anchorId="11F1B869" wp14:editId="013C56AF">
+                  <wp:extent cx="201761" cy="191069"/>
+                  <wp:effectExtent l="0" t="0" r="8255" b="0"/>
+                  <wp:docPr id="316769474" name="Picture 316769474"/>
+                  <wp:cNvGraphicFramePr>
+                    <a:graphicFrameLocks xmlns:a="http://schemas.openxmlformats.org/drawingml/2006/main" noChangeAspect="1"/>
+                  </wp:cNvGraphicFramePr>
+                  <a:graphic xmlns:a="http://schemas.openxmlformats.org/drawingml/2006/main">
+                    <a:graphicData uri="http://schemas.openxmlformats.org/drawingml/2006/picture">
+                      <pic:pic xmlns:pic="http://schemas.openxmlformats.org/drawingml/2006/picture">
+                        <pic:nvPicPr>
+                          <pic:cNvPr id="1" name="th[1].png"/>
+                          <pic:cNvPicPr/>
+                        </pic:nvPicPr>
+                        <pic:blipFill>
+                          <a:blip r:embed="rId8" cstate="print">
+                            <a:extLst>
+                              <a:ext uri="{28A0092B-C50C-407E-A947-70E740481C1C}">
+                                <a14:useLocalDpi xmlns:a14="http://schemas.microsoft.com/office/drawing/2010/main" val="0"/>
+                              </a:ext>
+                            </a:extLst>
+                          </a:blip>
+                          <a:stretch>
+                            <a:fillRect/>
+                          </a:stretch>
+                        </pic:blipFill>
+                        <pic:spPr>
+                          <a:xfrm>
+                            <a:off x="0" y="0"/>
+                            <a:ext cx="214886" cy="203498"/>
+                          </a:xfrm>
+                          <a:prstGeom prst="rect">
+                            <a:avLst/>
+                          </a:prstGeom>
+                        </pic:spPr>
+                      </pic:pic>
+                    </a:graphicData>
+                  </a:graphic>
+                </wp:inline>
+              </w:drawing>
+            </w:r>
           </w:p>
         </w:tc>
         <w:tc>
@@ -6020,6 +6451,130 @@
                 <w:lang w:bidi="th-TH"/>
               </w:rPr>
             </w:pPr>
+            <w:r>
+              <w:rPr>
+                <w:rFonts w:ascii="TH SarabunPSK" w:hAnsi="TH SarabunPSK" w:cs="TH SarabunPSK" w:hint="cs"/>
+                <w:sz w:val="32"/>
+                <w:szCs w:val="32"/>
+                <w:cs/>
+                <w:lang w:bidi="th-TH"/>
+              </w:rPr>
+              <w:t xml:space="preserve">แสดงหน้า </w:t>
+            </w:r>
+            <w:r>
+              <w:rPr>
+                <w:rFonts w:ascii="TH SarabunPSK" w:hAnsi="TH SarabunPSK" w:cs="TH SarabunPSK" w:hint="cs"/>
+                <w:sz w:val="32"/>
+                <w:szCs w:val="32"/>
+                <w:lang w:bidi="th-TH"/>
+              </w:rPr>
+              <w:t>Success</w:t>
+            </w:r>
+            <w:r>
+              <w:rPr>
+                <w:rFonts w:ascii="TH SarabunPSK" w:hAnsi="TH SarabunPSK" w:cs="TH SarabunPSK" w:hint="cs"/>
+                <w:sz w:val="32"/>
+                <w:szCs w:val="32"/>
+                <w:cs/>
+                <w:lang w:bidi="th-TH"/>
+              </w:rPr>
+              <w:t>.</w:t>
+            </w:r>
+            <w:r>
+              <w:rPr>
+                <w:rFonts w:ascii="TH SarabunPSK" w:hAnsi="TH SarabunPSK" w:cs="TH SarabunPSK" w:hint="cs"/>
+                <w:sz w:val="32"/>
+                <w:szCs w:val="32"/>
+                <w:lang w:bidi="th-TH"/>
+              </w:rPr>
+              <w:t xml:space="preserve">html </w:t>
+            </w:r>
+            <w:r>
+              <w:rPr>
+                <w:rFonts w:ascii="TH SarabunPSK" w:hAnsi="TH SarabunPSK" w:cs="TH SarabunPSK" w:hint="cs"/>
+                <w:sz w:val="32"/>
+                <w:szCs w:val="32"/>
+                <w:cs/>
+                <w:lang w:bidi="th-TH"/>
+              </w:rPr>
+              <w:t xml:space="preserve">โดยมี </w:t>
+            </w:r>
+            <w:r>
+              <w:rPr>
+                <w:rFonts w:ascii="TH SarabunPSK" w:hAnsi="TH SarabunPSK" w:cs="TH SarabunPSK" w:hint="cs"/>
+                <w:sz w:val="32"/>
+                <w:szCs w:val="32"/>
+                <w:lang w:bidi="th-TH"/>
+              </w:rPr>
+              <w:t xml:space="preserve">Title </w:t>
+            </w:r>
+            <w:r>
+              <w:rPr>
+                <w:rFonts w:ascii="TH SarabunPSK" w:hAnsi="TH SarabunPSK" w:cs="TH SarabunPSK" w:hint="cs"/>
+                <w:sz w:val="32"/>
+                <w:szCs w:val="32"/>
+                <w:cs/>
+                <w:lang w:bidi="th-TH"/>
+              </w:rPr>
+              <w:t>เป็น “</w:t>
+            </w:r>
+            <w:r>
+              <w:rPr>
+                <w:rFonts w:ascii="TH SarabunPSK" w:hAnsi="TH SarabunPSK" w:cs="TH SarabunPSK" w:hint="cs"/>
+                <w:sz w:val="32"/>
+                <w:szCs w:val="32"/>
+                <w:lang w:bidi="th-TH"/>
+              </w:rPr>
+              <w:t>Success</w:t>
+            </w:r>
+            <w:r>
+              <w:rPr>
+                <w:rFonts w:ascii="TH SarabunPSK" w:hAnsi="TH SarabunPSK" w:cs="TH SarabunPSK" w:hint="cs"/>
+                <w:sz w:val="32"/>
+                <w:szCs w:val="32"/>
+                <w:cs/>
+                <w:lang w:bidi="th-TH"/>
+              </w:rPr>
+              <w:t>” และแสดงข้อความ “</w:t>
+            </w:r>
+            <w:r>
+              <w:rPr>
+                <w:rFonts w:ascii="TH SarabunPSK" w:hAnsi="TH SarabunPSK" w:cs="TH SarabunPSK"/>
+                <w:sz w:val="32"/>
+                <w:szCs w:val="32"/>
+                <w:lang w:bidi="th-TH"/>
+              </w:rPr>
+              <w:t>Thank you for registering with us.</w:t>
+            </w:r>
+            <w:r>
+              <w:rPr>
+                <w:rFonts w:ascii="TH SarabunPSK" w:hAnsi="TH SarabunPSK" w:cs="TH SarabunPSK" w:hint="cs"/>
+                <w:sz w:val="32"/>
+                <w:szCs w:val="32"/>
+                <w:cs/>
+                <w:lang w:bidi="th-TH"/>
+              </w:rPr>
+              <w:t>” และ “</w:t>
+            </w:r>
+            <w:r>
+              <w:rPr>
+                <w:rFonts w:ascii="TH SarabunPSK" w:hAnsi="TH SarabunPSK" w:cs="TH SarabunPSK"/>
+                <w:sz w:val="32"/>
+                <w:szCs w:val="32"/>
+                <w:lang w:bidi="th-TH"/>
+              </w:rPr>
+              <w:t>We will send a confirmation to your email soon.</w:t>
+            </w:r>
+            <w:r>
+              <w:rPr>
+                <w:rFonts w:ascii="TH SarabunPSK" w:hAnsi="TH SarabunPSK" w:cs="TH SarabunPSK" w:hint="cs"/>
+                <w:sz w:val="32"/>
+                <w:szCs w:val="32"/>
+                <w:cs/>
+                <w:lang w:bidi="th-TH"/>
+              </w:rPr>
+              <w:t>”</w:t>
+            </w:r>
           </w:p>
         </w:tc>
         <w:tc>
@@ -6028,13 +6583,64 @@
           </w:tcPr>
           <w:p>
             <w:pPr>
-              <w:rPr>
-                <w:rFonts w:ascii="TH SarabunPSK" w:hAnsi="TH SarabunPSK" w:cs="TH SarabunPSK"/>
-                <w:sz w:val="32"/>
-                <w:szCs w:val="32"/>
-                <w:lang w:bidi="th-TH"/>
-              </w:rPr>
-            </w:pPr>
+              <w:jc w:val="center"/>
+              <w:rPr>
+                <w:rFonts w:ascii="TH SarabunPSK" w:hAnsi="TH SarabunPSK" w:cs="TH SarabunPSK"/>
+                <w:sz w:val="32"/>
+                <w:szCs w:val="32"/>
+                <w:lang w:bidi="th-TH"/>
+              </w:rPr>
+            </w:pPr>
+            <w:r>
+              <w:rPr>
+                <w:rFonts w:ascii="TH SarabunPSK" w:hAnsi="TH SarabunPSK" w:cs="TH SarabunPSK" w:hint="cs"/>
+                <w:noProof/>
+                <w:sz w:val="32"/>
+                <w:szCs w:val="32"/>
+                <w:lang w:bidi="th-TH"/>
+              </w:rPr>
+              <w:drawing>
+                <wp:inline distT="0" distB="0" distL="0" distR="0" wp14:anchorId="4364EFBE" wp14:editId="124E1801">
+                  <wp:extent cx="201761" cy="191069"/>
+                  <wp:effectExtent l="0" t="0" r="8255" b="0"/>
+                  <wp:docPr id="1490485003" name="Picture 1490485003"/>
+                  <wp:cNvGraphicFramePr>
+                    <a:graphicFrameLocks xmlns:a="http://schemas.openxmlformats.org/drawingml/2006/main" noChangeAspect="1"/>
+                  </wp:cNvGraphicFramePr>
+                  <a:graphic xmlns:a="http://schemas.openxmlformats.org/drawingml/2006/main">
+                    <a:graphicData uri="http://schemas.openxmlformats.org/drawingml/2006/picture">
+                      <pic:pic xmlns:pic="http://schemas.openxmlformats.org/drawingml/2006/picture">
+                        <pic:nvPicPr>
+                          <pic:cNvPr id="1" name="th[1].png"/>
+                          <pic:cNvPicPr/>
+                        </pic:nvPicPr>
+                        <pic:blipFill>
+                          <a:blip r:embed="rId8" cstate="print">
+                            <a:extLst>
+                              <a:ext uri="{28A0092B-C50C-407E-A947-70E740481C1C}">
+                                <a14:useLocalDpi xmlns:a14="http://schemas.microsoft.com/office/drawing/2010/main" val="0"/>
+                              </a:ext>
+                            </a:extLst>
+                          </a:blip>
+                          <a:stretch>
+                            <a:fillRect/>
+                          </a:stretch>
+                        </pic:blipFill>
+                        <pic:spPr>
+                          <a:xfrm>
+                            <a:off x="0" y="0"/>
+                            <a:ext cx="214886" cy="203498"/>
+                          </a:xfrm>
+                          <a:prstGeom prst="rect">
+                            <a:avLst/>
+                          </a:prstGeom>
+                        </pic:spPr>
+                      </pic:pic>
+                    </a:graphicData>
+                  </a:graphic>
+                </wp:inline>
+              </w:drawing>
+            </w:r>
           </w:p>
         </w:tc>
         <w:tc>
@@ -6167,7 +6773,6 @@
                 <w:szCs w:val="32"/>
                 <w:lang w:bidi="th-TH"/>
               </w:rPr>
-              <w:lastRenderedPageBreak/>
               <w:t>Test Scenario ID</w:t>
             </w:r>
             <w:r>
@@ -6525,6 +7130,16 @@
                 <w:lang w:bidi="th-TH"/>
               </w:rPr>
             </w:pPr>
+            <w:r>
+              <w:rPr>
+                <w:rFonts w:ascii="TH SarabunPSK" w:hAnsi="TH SarabunPSK" w:cs="TH SarabunPSK" w:hint="cs"/>
+                <w:sz w:val="32"/>
+                <w:szCs w:val="32"/>
+                <w:cs/>
+                <w:lang w:bidi="th-TH"/>
+              </w:rPr>
+              <w:t>ศุภวิชญ์ ศักดิ์เทวินทร์</w:t>
+            </w:r>
           </w:p>
         </w:tc>
       </w:tr>
@@ -6889,6 +7504,15 @@
                 <w:lang w:bidi="th-TH"/>
               </w:rPr>
             </w:pPr>
+            <w:r>
+              <w:rPr>
+                <w:rFonts w:ascii="TH SarabunPSK" w:hAnsi="TH SarabunPSK" w:cs="TH SarabunPSK"/>
+                <w:sz w:val="32"/>
+                <w:szCs w:val="32"/>
+                <w:lang w:bidi="th-TH"/>
+              </w:rPr>
+              <w:t>30/12/2568</w:t>
+            </w:r>
           </w:p>
         </w:tc>
       </w:tr>
@@ -7685,6 +8309,53 @@
                 <w:lang w:bidi="th-TH"/>
               </w:rPr>
             </w:pPr>
+            <w:r>
+              <w:rPr>
+                <w:rFonts w:ascii="TH SarabunPSK" w:hAnsi="TH SarabunPSK" w:cs="TH SarabunPSK" w:hint="cs"/>
+                <w:sz w:val="32"/>
+                <w:szCs w:val="32"/>
+                <w:cs/>
+                <w:lang w:bidi="th-TH"/>
+              </w:rPr>
+              <w:t>แสดงหน้า</w:t>
+            </w:r>
+            <w:r>
+              <w:rPr>
+                <w:rFonts w:ascii="TH SarabunPSK" w:hAnsi="TH SarabunPSK" w:cs="TH SarabunPSK" w:hint="cs"/>
+                <w:sz w:val="32"/>
+                <w:szCs w:val="32"/>
+                <w:lang w:bidi="th-TH"/>
+              </w:rPr>
+              <w:t xml:space="preserve"> </w:t>
+            </w:r>
+          </w:p>
+          <w:p>
+            <w:pPr>
+              <w:rPr>
+                <w:rFonts w:ascii="TH SarabunPSK" w:hAnsi="TH SarabunPSK" w:cs="TH SarabunPSK"/>
+                <w:sz w:val="32"/>
+                <w:szCs w:val="32"/>
+                <w:lang w:bidi="th-TH"/>
+              </w:rPr>
+            </w:pPr>
+            <w:r>
+              <w:rPr>
+                <w:rFonts w:ascii="TH SarabunPSK" w:hAnsi="TH SarabunPSK" w:cs="TH SarabunPSK"/>
+                <w:sz w:val="32"/>
+                <w:szCs w:val="32"/>
+                <w:lang w:bidi="th-TH"/>
+              </w:rPr>
+              <w:t>Workshop</w:t>
+            </w:r>
+            <w:r>
+              <w:rPr>
+                <w:rFonts w:ascii="TH SarabunPSK" w:hAnsi="TH SarabunPSK" w:cs="TH SarabunPSK" w:hint="cs"/>
+                <w:sz w:val="32"/>
+                <w:szCs w:val="32"/>
+                <w:lang w:bidi="th-TH"/>
+              </w:rPr>
+              <w:t xml:space="preserve"> Registration</w:t>
+            </w:r>
           </w:p>
         </w:tc>
         <w:tc>
@@ -7693,13 +8364,64 @@
           </w:tcPr>
           <w:p>
             <w:pPr>
-              <w:rPr>
-                <w:rFonts w:ascii="TH SarabunPSK" w:hAnsi="TH SarabunPSK" w:cs="TH SarabunPSK"/>
-                <w:sz w:val="32"/>
-                <w:szCs w:val="32"/>
-                <w:lang w:bidi="th-TH"/>
-              </w:rPr>
-            </w:pPr>
+              <w:jc w:val="center"/>
+              <w:rPr>
+                <w:rFonts w:ascii="TH SarabunPSK" w:hAnsi="TH SarabunPSK" w:cs="TH SarabunPSK"/>
+                <w:sz w:val="32"/>
+                <w:szCs w:val="32"/>
+                <w:lang w:bidi="th-TH"/>
+              </w:rPr>
+            </w:pPr>
+            <w:r>
+              <w:rPr>
+                <w:rFonts w:ascii="TH SarabunPSK" w:hAnsi="TH SarabunPSK" w:cs="TH SarabunPSK" w:hint="cs"/>
+                <w:noProof/>
+                <w:sz w:val="32"/>
+                <w:szCs w:val="32"/>
+                <w:lang w:bidi="th-TH"/>
+              </w:rPr>
+              <w:drawing>
+                <wp:inline distT="0" distB="0" distL="0" distR="0" wp14:anchorId="7C9A177D" wp14:editId="3E841843">
+                  <wp:extent cx="201761" cy="191069"/>
+                  <wp:effectExtent l="0" t="0" r="8255" b="0"/>
+                  <wp:docPr id="1614628060" name="Picture 1614628060"/>
+                  <wp:cNvGraphicFramePr>
+                    <a:graphicFrameLocks xmlns:a="http://schemas.openxmlformats.org/drawingml/2006/main" noChangeAspect="1"/>
+                  </wp:cNvGraphicFramePr>
+                  <a:graphic xmlns:a="http://schemas.openxmlformats.org/drawingml/2006/main">
+                    <a:graphicData uri="http://schemas.openxmlformats.org/drawingml/2006/picture">
+                      <pic:pic xmlns:pic="http://schemas.openxmlformats.org/drawingml/2006/picture">
+                        <pic:nvPicPr>
+                          <pic:cNvPr id="1" name="th[1].png"/>
+                          <pic:cNvPicPr/>
+                        </pic:nvPicPr>
+                        <pic:blipFill>
+                          <a:blip r:embed="rId8" cstate="print">
+                            <a:extLst>
+                              <a:ext uri="{28A0092B-C50C-407E-A947-70E740481C1C}">
+                                <a14:useLocalDpi xmlns:a14="http://schemas.microsoft.com/office/drawing/2010/main" val="0"/>
+                              </a:ext>
+                            </a:extLst>
+                          </a:blip>
+                          <a:stretch>
+                            <a:fillRect/>
+                          </a:stretch>
+                        </pic:blipFill>
+                        <pic:spPr>
+                          <a:xfrm>
+                            <a:off x="0" y="0"/>
+                            <a:ext cx="214886" cy="203498"/>
+                          </a:xfrm>
+                          <a:prstGeom prst="rect">
+                            <a:avLst/>
+                          </a:prstGeom>
+                        </pic:spPr>
+                      </pic:pic>
+                    </a:graphicData>
+                  </a:graphic>
+                </wp:inline>
+              </w:drawing>
+            </w:r>
           </w:p>
         </w:tc>
         <w:tc>
@@ -8370,6 +9092,63 @@
                 <w:lang w:bidi="th-TH"/>
               </w:rPr>
             </w:pPr>
+            <w:r>
+              <w:rPr>
+                <w:rFonts w:ascii="TH SarabunPSK" w:hAnsi="TH SarabunPSK" w:cs="TH SarabunPSK" w:hint="cs"/>
+                <w:sz w:val="32"/>
+                <w:szCs w:val="32"/>
+                <w:cs/>
+                <w:lang w:bidi="th-TH"/>
+              </w:rPr>
+              <w:t xml:space="preserve">อยู่ที่หน้า </w:t>
+            </w:r>
+            <w:r>
+              <w:rPr>
+                <w:rFonts w:ascii="TH SarabunPSK" w:hAnsi="TH SarabunPSK" w:cs="TH SarabunPSK"/>
+                <w:sz w:val="32"/>
+                <w:szCs w:val="32"/>
+                <w:lang w:bidi="th-TH"/>
+              </w:rPr>
+              <w:t>Workshop</w:t>
+            </w:r>
+            <w:r>
+              <w:rPr>
+                <w:rFonts w:ascii="TH SarabunPSK" w:hAnsi="TH SarabunPSK" w:cs="TH SarabunPSK" w:hint="cs"/>
+                <w:sz w:val="32"/>
+                <w:szCs w:val="32"/>
+                <w:lang w:bidi="th-TH"/>
+              </w:rPr>
+              <w:t xml:space="preserve"> Registration </w:t>
+            </w:r>
+            <w:r>
+              <w:rPr>
+                <w:rFonts w:ascii="TH SarabunPSK" w:hAnsi="TH SarabunPSK" w:cs="TH SarabunPSK" w:hint="cs"/>
+                <w:sz w:val="32"/>
+                <w:szCs w:val="32"/>
+                <w:cs/>
+                <w:lang w:bidi="th-TH"/>
+              </w:rPr>
+              <w:t>เช่นเดิม และมีการแสดงข้อความ “</w:t>
+            </w:r>
+            <w:r>
+              <w:rPr>
+                <w:rFonts w:ascii="TH SarabunPSK" w:hAnsi="TH SarabunPSK" w:cs="TH SarabunPSK" w:hint="cs"/>
+                <w:sz w:val="32"/>
+                <w:szCs w:val="32"/>
+                <w:lang w:bidi="th-TH"/>
+              </w:rPr>
+              <w:t>Please enter your first name</w:t>
+            </w:r>
+            <w:r>
+              <w:rPr>
+                <w:rFonts w:ascii="TH SarabunPSK" w:hAnsi="TH SarabunPSK" w:cs="TH SarabunPSK" w:hint="cs"/>
+                <w:sz w:val="32"/>
+                <w:szCs w:val="32"/>
+                <w:cs/>
+                <w:lang w:bidi="th-TH"/>
+              </w:rPr>
+              <w:t>!!”</w:t>
+            </w:r>
           </w:p>
         </w:tc>
         <w:tc>
@@ -8378,13 +9157,64 @@
           </w:tcPr>
           <w:p>
             <w:pPr>
-              <w:rPr>
-                <w:rFonts w:ascii="TH SarabunPSK" w:hAnsi="TH SarabunPSK" w:cs="TH SarabunPSK"/>
-                <w:sz w:val="32"/>
-                <w:szCs w:val="32"/>
-                <w:lang w:bidi="th-TH"/>
-              </w:rPr>
-            </w:pPr>
+              <w:jc w:val="center"/>
+              <w:rPr>
+                <w:rFonts w:ascii="TH SarabunPSK" w:hAnsi="TH SarabunPSK" w:cs="TH SarabunPSK"/>
+                <w:sz w:val="32"/>
+                <w:szCs w:val="32"/>
+                <w:lang w:bidi="th-TH"/>
+              </w:rPr>
+            </w:pPr>
+            <w:r>
+              <w:rPr>
+                <w:rFonts w:ascii="TH SarabunPSK" w:hAnsi="TH SarabunPSK" w:cs="TH SarabunPSK" w:hint="cs"/>
+                <w:noProof/>
+                <w:sz w:val="32"/>
+                <w:szCs w:val="32"/>
+                <w:lang w:bidi="th-TH"/>
+              </w:rPr>
+              <w:drawing>
+                <wp:inline distT="0" distB="0" distL="0" distR="0" wp14:anchorId="6302D096" wp14:editId="7E08F32A">
+                  <wp:extent cx="201761" cy="191069"/>
+                  <wp:effectExtent l="0" t="0" r="8255" b="0"/>
+                  <wp:docPr id="1529676676" name="Picture 1529676676"/>
+                  <wp:cNvGraphicFramePr>
+                    <a:graphicFrameLocks xmlns:a="http://schemas.openxmlformats.org/drawingml/2006/main" noChangeAspect="1"/>
+                  </wp:cNvGraphicFramePr>
+                  <a:graphic xmlns:a="http://schemas.openxmlformats.org/drawingml/2006/main">
+                    <a:graphicData uri="http://schemas.openxmlformats.org/drawingml/2006/picture">
+                      <pic:pic xmlns:pic="http://schemas.openxmlformats.org/drawingml/2006/picture">
+                        <pic:nvPicPr>
+                          <pic:cNvPr id="1" name="th[1].png"/>
+                          <pic:cNvPicPr/>
+                        </pic:nvPicPr>
+                        <pic:blipFill>
+                          <a:blip r:embed="rId8" cstate="print">
+                            <a:extLst>
+                              <a:ext uri="{28A0092B-C50C-407E-A947-70E740481C1C}">
+                                <a14:useLocalDpi xmlns:a14="http://schemas.microsoft.com/office/drawing/2010/main" val="0"/>
+                              </a:ext>
+                            </a:extLst>
+                          </a:blip>
+                          <a:stretch>
+                            <a:fillRect/>
+                          </a:stretch>
+                        </pic:blipFill>
+                        <pic:spPr>
+                          <a:xfrm>
+                            <a:off x="0" y="0"/>
+                            <a:ext cx="214886" cy="203498"/>
+                          </a:xfrm>
+                          <a:prstGeom prst="rect">
+                            <a:avLst/>
+                          </a:prstGeom>
+                        </pic:spPr>
+                      </pic:pic>
+                    </a:graphicData>
+                  </a:graphic>
+                </wp:inline>
+              </w:drawing>
+            </w:r>
           </w:p>
         </w:tc>
         <w:tc>
@@ -8429,7 +9259,6 @@
                 <w:szCs w:val="32"/>
                 <w:lang w:bidi="th-TH"/>
               </w:rPr>
-              <w:lastRenderedPageBreak/>
               <w:t>No</w:t>
             </w:r>
             <w:r>
@@ -8922,6 +9751,34 @@
                 <w:lang w:bidi="th-TH"/>
               </w:rPr>
             </w:pPr>
+            <w:r>
+              <w:rPr>
+                <w:rFonts w:ascii="TH SarabunPSK" w:hAnsi="TH SarabunPSK" w:cs="TH SarabunPSK" w:hint="cs"/>
+                <w:sz w:val="32"/>
+                <w:szCs w:val="32"/>
+                <w:cs/>
+                <w:lang w:bidi="th-TH"/>
+              </w:rPr>
+              <w:t xml:space="preserve">แสดงหน้า </w:t>
+            </w:r>
+            <w:r>
+              <w:rPr>
+                <w:rFonts w:ascii="TH SarabunPSK" w:hAnsi="TH SarabunPSK" w:cs="TH SarabunPSK"/>
+                <w:sz w:val="32"/>
+                <w:szCs w:val="32"/>
+                <w:lang w:bidi="th-TH"/>
+              </w:rPr>
+              <w:t>Workshop</w:t>
+            </w:r>
+            <w:r>
+              <w:rPr>
+                <w:rFonts w:ascii="TH SarabunPSK" w:hAnsi="TH SarabunPSK" w:cs="TH SarabunPSK" w:hint="cs"/>
+                <w:sz w:val="32"/>
+                <w:szCs w:val="32"/>
+                <w:lang w:bidi="th-TH"/>
+              </w:rPr>
+              <w:t xml:space="preserve"> Registration</w:t>
+            </w:r>
           </w:p>
         </w:tc>
         <w:tc>
@@ -8930,13 +9787,64 @@
           </w:tcPr>
           <w:p>
             <w:pPr>
-              <w:rPr>
-                <w:rFonts w:ascii="TH SarabunPSK" w:hAnsi="TH SarabunPSK" w:cs="TH SarabunPSK"/>
-                <w:sz w:val="32"/>
-                <w:szCs w:val="32"/>
-                <w:lang w:bidi="th-TH"/>
-              </w:rPr>
-            </w:pPr>
+              <w:jc w:val="center"/>
+              <w:rPr>
+                <w:rFonts w:ascii="TH SarabunPSK" w:hAnsi="TH SarabunPSK" w:cs="TH SarabunPSK"/>
+                <w:sz w:val="32"/>
+                <w:szCs w:val="32"/>
+                <w:lang w:bidi="th-TH"/>
+              </w:rPr>
+            </w:pPr>
+            <w:r>
+              <w:rPr>
+                <w:rFonts w:ascii="TH SarabunPSK" w:hAnsi="TH SarabunPSK" w:cs="TH SarabunPSK" w:hint="cs"/>
+                <w:noProof/>
+                <w:sz w:val="32"/>
+                <w:szCs w:val="32"/>
+                <w:lang w:bidi="th-TH"/>
+              </w:rPr>
+              <w:drawing>
+                <wp:inline distT="0" distB="0" distL="0" distR="0" wp14:anchorId="4D3A2CD0" wp14:editId="4BD5F483">
+                  <wp:extent cx="201761" cy="191069"/>
+                  <wp:effectExtent l="0" t="0" r="8255" b="0"/>
+                  <wp:docPr id="939544270" name="Picture 939544270"/>
+                  <wp:cNvGraphicFramePr>
+                    <a:graphicFrameLocks xmlns:a="http://schemas.openxmlformats.org/drawingml/2006/main" noChangeAspect="1"/>
+                  </wp:cNvGraphicFramePr>
+                  <a:graphic xmlns:a="http://schemas.openxmlformats.org/drawingml/2006/main">
+                    <a:graphicData uri="http://schemas.openxmlformats.org/drawingml/2006/picture">
+                      <pic:pic xmlns:pic="http://schemas.openxmlformats.org/drawingml/2006/picture">
+                        <pic:nvPicPr>
+                          <pic:cNvPr id="1" name="th[1].png"/>
+                          <pic:cNvPicPr/>
+                        </pic:nvPicPr>
+                        <pic:blipFill>
+                          <a:blip r:embed="rId8" cstate="print">
+                            <a:extLst>
+                              <a:ext uri="{28A0092B-C50C-407E-A947-70E740481C1C}">
+                                <a14:useLocalDpi xmlns:a14="http://schemas.microsoft.com/office/drawing/2010/main" val="0"/>
+                              </a:ext>
+                            </a:extLst>
+                          </a:blip>
+                          <a:stretch>
+                            <a:fillRect/>
+                          </a:stretch>
+                        </pic:blipFill>
+                        <pic:spPr>
+                          <a:xfrm>
+                            <a:off x="0" y="0"/>
+                            <a:ext cx="214886" cy="203498"/>
+                          </a:xfrm>
+                          <a:prstGeom prst="rect">
+                            <a:avLst/>
+                          </a:prstGeom>
+                        </pic:spPr>
+                      </pic:pic>
+                    </a:graphicData>
+                  </a:graphic>
+                </wp:inline>
+              </w:drawing>
+            </w:r>
           </w:p>
         </w:tc>
         <w:tc>
@@ -9604,6 +10512,63 @@
                 <w:lang w:bidi="th-TH"/>
               </w:rPr>
             </w:pPr>
+            <w:r>
+              <w:rPr>
+                <w:rFonts w:ascii="TH SarabunPSK" w:hAnsi="TH SarabunPSK" w:cs="TH SarabunPSK" w:hint="cs"/>
+                <w:sz w:val="32"/>
+                <w:szCs w:val="32"/>
+                <w:cs/>
+                <w:lang w:bidi="th-TH"/>
+              </w:rPr>
+              <w:t xml:space="preserve">อยู่ที่หน้า </w:t>
+            </w:r>
+            <w:r>
+              <w:rPr>
+                <w:rFonts w:ascii="TH SarabunPSK" w:hAnsi="TH SarabunPSK" w:cs="TH SarabunPSK"/>
+                <w:sz w:val="32"/>
+                <w:szCs w:val="32"/>
+                <w:lang w:bidi="th-TH"/>
+              </w:rPr>
+              <w:t>Workshop</w:t>
+            </w:r>
+            <w:r>
+              <w:rPr>
+                <w:rFonts w:ascii="TH SarabunPSK" w:hAnsi="TH SarabunPSK" w:cs="TH SarabunPSK" w:hint="cs"/>
+                <w:sz w:val="32"/>
+                <w:szCs w:val="32"/>
+                <w:lang w:bidi="th-TH"/>
+              </w:rPr>
+              <w:t xml:space="preserve"> Registration </w:t>
+            </w:r>
+            <w:r>
+              <w:rPr>
+                <w:rFonts w:ascii="TH SarabunPSK" w:hAnsi="TH SarabunPSK" w:cs="TH SarabunPSK" w:hint="cs"/>
+                <w:sz w:val="32"/>
+                <w:szCs w:val="32"/>
+                <w:cs/>
+                <w:lang w:bidi="th-TH"/>
+              </w:rPr>
+              <w:t>เช่นเดิม และมีการแสดงข้อความ “</w:t>
+            </w:r>
+            <w:r>
+              <w:rPr>
+                <w:rFonts w:ascii="TH SarabunPSK" w:hAnsi="TH SarabunPSK" w:cs="TH SarabunPSK" w:hint="cs"/>
+                <w:sz w:val="32"/>
+                <w:szCs w:val="32"/>
+                <w:lang w:bidi="th-TH"/>
+              </w:rPr>
+              <w:t>Please enter your last name</w:t>
+            </w:r>
+            <w:r>
+              <w:rPr>
+                <w:rFonts w:ascii="TH SarabunPSK" w:hAnsi="TH SarabunPSK" w:cs="TH SarabunPSK" w:hint="cs"/>
+                <w:sz w:val="32"/>
+                <w:szCs w:val="32"/>
+                <w:cs/>
+                <w:lang w:bidi="th-TH"/>
+              </w:rPr>
+              <w:t>!!”</w:t>
+            </w:r>
           </w:p>
         </w:tc>
         <w:tc>
@@ -9612,13 +10577,64 @@
           </w:tcPr>
           <w:p>
             <w:pPr>
-              <w:rPr>
-                <w:rFonts w:ascii="TH SarabunPSK" w:hAnsi="TH SarabunPSK" w:cs="TH SarabunPSK"/>
-                <w:sz w:val="32"/>
-                <w:szCs w:val="32"/>
-                <w:lang w:bidi="th-TH"/>
-              </w:rPr>
-            </w:pPr>
+              <w:jc w:val="center"/>
+              <w:rPr>
+                <w:rFonts w:ascii="TH SarabunPSK" w:hAnsi="TH SarabunPSK" w:cs="TH SarabunPSK"/>
+                <w:sz w:val="32"/>
+                <w:szCs w:val="32"/>
+                <w:lang w:bidi="th-TH"/>
+              </w:rPr>
+            </w:pPr>
+            <w:r>
+              <w:rPr>
+                <w:rFonts w:ascii="TH SarabunPSK" w:hAnsi="TH SarabunPSK" w:cs="TH SarabunPSK" w:hint="cs"/>
+                <w:noProof/>
+                <w:sz w:val="32"/>
+                <w:szCs w:val="32"/>
+                <w:lang w:bidi="th-TH"/>
+              </w:rPr>
+              <w:drawing>
+                <wp:inline distT="0" distB="0" distL="0" distR="0" wp14:anchorId="0C3EC1D5" wp14:editId="5E9ECDC3">
+                  <wp:extent cx="201761" cy="191069"/>
+                  <wp:effectExtent l="0" t="0" r="8255" b="0"/>
+                  <wp:docPr id="345236610" name="Picture 345236610"/>
+                  <wp:cNvGraphicFramePr>
+                    <a:graphicFrameLocks xmlns:a="http://schemas.openxmlformats.org/drawingml/2006/main" noChangeAspect="1"/>
+                  </wp:cNvGraphicFramePr>
+                  <a:graphic xmlns:a="http://schemas.openxmlformats.org/drawingml/2006/main">
+                    <a:graphicData uri="http://schemas.openxmlformats.org/drawingml/2006/picture">
+                      <pic:pic xmlns:pic="http://schemas.openxmlformats.org/drawingml/2006/picture">
+                        <pic:nvPicPr>
+                          <pic:cNvPr id="1" name="th[1].png"/>
+                          <pic:cNvPicPr/>
+                        </pic:nvPicPr>
+                        <pic:blipFill>
+                          <a:blip r:embed="rId8" cstate="print">
+                            <a:extLst>
+                              <a:ext uri="{28A0092B-C50C-407E-A947-70E740481C1C}">
+                                <a14:useLocalDpi xmlns:a14="http://schemas.microsoft.com/office/drawing/2010/main" val="0"/>
+                              </a:ext>
+                            </a:extLst>
+                          </a:blip>
+                          <a:stretch>
+                            <a:fillRect/>
+                          </a:stretch>
+                        </pic:blipFill>
+                        <pic:spPr>
+                          <a:xfrm>
+                            <a:off x="0" y="0"/>
+                            <a:ext cx="214886" cy="203498"/>
+                          </a:xfrm>
+                          <a:prstGeom prst="rect">
+                            <a:avLst/>
+                          </a:prstGeom>
+                        </pic:spPr>
+                      </pic:pic>
+                    </a:graphicData>
+                  </a:graphic>
+                </wp:inline>
+              </w:drawing>
+            </w:r>
           </w:p>
         </w:tc>
         <w:tc>
@@ -10155,6 +11171,34 @@
                 <w:lang w:bidi="th-TH"/>
               </w:rPr>
             </w:pPr>
+            <w:r>
+              <w:rPr>
+                <w:rFonts w:ascii="TH SarabunPSK" w:hAnsi="TH SarabunPSK" w:cs="TH SarabunPSK" w:hint="cs"/>
+                <w:sz w:val="32"/>
+                <w:szCs w:val="32"/>
+                <w:cs/>
+                <w:lang w:bidi="th-TH"/>
+              </w:rPr>
+              <w:t xml:space="preserve">แสดงหน้า </w:t>
+            </w:r>
+            <w:r>
+              <w:rPr>
+                <w:rFonts w:ascii="TH SarabunPSK" w:hAnsi="TH SarabunPSK" w:cs="TH SarabunPSK"/>
+                <w:sz w:val="32"/>
+                <w:szCs w:val="32"/>
+                <w:lang w:bidi="th-TH"/>
+              </w:rPr>
+              <w:t>Workshop</w:t>
+            </w:r>
+            <w:r>
+              <w:rPr>
+                <w:rFonts w:ascii="TH SarabunPSK" w:hAnsi="TH SarabunPSK" w:cs="TH SarabunPSK" w:hint="cs"/>
+                <w:sz w:val="32"/>
+                <w:szCs w:val="32"/>
+                <w:lang w:bidi="th-TH"/>
+              </w:rPr>
+              <w:t xml:space="preserve"> Registration</w:t>
+            </w:r>
           </w:p>
         </w:tc>
         <w:tc>
@@ -10163,13 +11207,64 @@
           </w:tcPr>
           <w:p>
             <w:pPr>
-              <w:rPr>
-                <w:rFonts w:ascii="TH SarabunPSK" w:hAnsi="TH SarabunPSK" w:cs="TH SarabunPSK"/>
-                <w:sz w:val="32"/>
-                <w:szCs w:val="32"/>
-                <w:lang w:bidi="th-TH"/>
-              </w:rPr>
-            </w:pPr>
+              <w:jc w:val="center"/>
+              <w:rPr>
+                <w:rFonts w:ascii="TH SarabunPSK" w:hAnsi="TH SarabunPSK" w:cs="TH SarabunPSK"/>
+                <w:sz w:val="32"/>
+                <w:szCs w:val="32"/>
+                <w:lang w:bidi="th-TH"/>
+              </w:rPr>
+            </w:pPr>
+            <w:r>
+              <w:rPr>
+                <w:rFonts w:ascii="TH SarabunPSK" w:hAnsi="TH SarabunPSK" w:cs="TH SarabunPSK" w:hint="cs"/>
+                <w:noProof/>
+                <w:sz w:val="32"/>
+                <w:szCs w:val="32"/>
+                <w:lang w:bidi="th-TH"/>
+              </w:rPr>
+              <w:drawing>
+                <wp:inline distT="0" distB="0" distL="0" distR="0" wp14:anchorId="3922ACBD" wp14:editId="0249934C">
+                  <wp:extent cx="201761" cy="191069"/>
+                  <wp:effectExtent l="0" t="0" r="8255" b="0"/>
+                  <wp:docPr id="1792204315" name="Picture 1792204315"/>
+                  <wp:cNvGraphicFramePr>
+                    <a:graphicFrameLocks xmlns:a="http://schemas.openxmlformats.org/drawingml/2006/main" noChangeAspect="1"/>
+                  </wp:cNvGraphicFramePr>
+                  <a:graphic xmlns:a="http://schemas.openxmlformats.org/drawingml/2006/main">
+                    <a:graphicData uri="http://schemas.openxmlformats.org/drawingml/2006/picture">
+                      <pic:pic xmlns:pic="http://schemas.openxmlformats.org/drawingml/2006/picture">
+                        <pic:nvPicPr>
+                          <pic:cNvPr id="1" name="th[1].png"/>
+                          <pic:cNvPicPr/>
+                        </pic:nvPicPr>
+                        <pic:blipFill>
+                          <a:blip r:embed="rId8" cstate="print">
+                            <a:extLst>
+                              <a:ext uri="{28A0092B-C50C-407E-A947-70E740481C1C}">
+                                <a14:useLocalDpi xmlns:a14="http://schemas.microsoft.com/office/drawing/2010/main" val="0"/>
+                              </a:ext>
+                            </a:extLst>
+                          </a:blip>
+                          <a:stretch>
+                            <a:fillRect/>
+                          </a:stretch>
+                        </pic:blipFill>
+                        <pic:spPr>
+                          <a:xfrm>
+                            <a:off x="0" y="0"/>
+                            <a:ext cx="214886" cy="203498"/>
+                          </a:xfrm>
+                          <a:prstGeom prst="rect">
+                            <a:avLst/>
+                          </a:prstGeom>
+                        </pic:spPr>
+                      </pic:pic>
+                    </a:graphicData>
+                  </a:graphic>
+                </wp:inline>
+              </w:drawing>
+            </w:r>
           </w:p>
         </w:tc>
         <w:tc>
@@ -10411,7 +11506,6 @@
                 <w:cs/>
                 <w:lang w:bidi="th-TH"/>
               </w:rPr>
-              <w:lastRenderedPageBreak/>
               <w:t xml:space="preserve">กรอกข้อมูลที่ช่อง </w:t>
             </w:r>
             <w:r>
@@ -10679,7 +11773,6 @@
                 <w:cs/>
                 <w:lang w:bidi="th-TH"/>
               </w:rPr>
-              <w:lastRenderedPageBreak/>
               <w:t xml:space="preserve">อยู่ที่หน้า </w:t>
             </w:r>
             <w:r>
@@ -10698,16 +11791,7 @@
                 <w:szCs w:val="32"/>
                 <w:lang w:bidi="th-TH"/>
               </w:rPr>
-              <w:t xml:space="preserve"> </w:t>
-            </w:r>
-            <w:r>
-              <w:rPr>
-                <w:rFonts w:ascii="TH SarabunPSK" w:hAnsi="TH SarabunPSK" w:cs="TH SarabunPSK" w:hint="cs"/>
-                <w:sz w:val="32"/>
-                <w:szCs w:val="32"/>
-                <w:lang w:bidi="th-TH"/>
-              </w:rPr>
-              <w:t xml:space="preserve">Registration </w:t>
+              <w:t xml:space="preserve"> Registration </w:t>
             </w:r>
             <w:r>
               <w:rPr>
@@ -10754,6 +11838,63 @@
                 <w:lang w:bidi="th-TH"/>
               </w:rPr>
             </w:pPr>
+            <w:r>
+              <w:rPr>
+                <w:rFonts w:ascii="TH SarabunPSK" w:hAnsi="TH SarabunPSK" w:cs="TH SarabunPSK" w:hint="cs"/>
+                <w:sz w:val="32"/>
+                <w:szCs w:val="32"/>
+                <w:cs/>
+                <w:lang w:bidi="th-TH"/>
+              </w:rPr>
+              <w:t xml:space="preserve">อยู่ที่หน้า </w:t>
+            </w:r>
+            <w:r>
+              <w:rPr>
+                <w:rFonts w:ascii="TH SarabunPSK" w:hAnsi="TH SarabunPSK" w:cs="TH SarabunPSK"/>
+                <w:sz w:val="32"/>
+                <w:szCs w:val="32"/>
+                <w:lang w:bidi="th-TH"/>
+              </w:rPr>
+              <w:t>Workshop</w:t>
+            </w:r>
+            <w:r>
+              <w:rPr>
+                <w:rFonts w:ascii="TH SarabunPSK" w:hAnsi="TH SarabunPSK" w:cs="TH SarabunPSK" w:hint="cs"/>
+                <w:sz w:val="32"/>
+                <w:szCs w:val="32"/>
+                <w:lang w:bidi="th-TH"/>
+              </w:rPr>
+              <w:t xml:space="preserve"> Registration </w:t>
+            </w:r>
+            <w:r>
+              <w:rPr>
+                <w:rFonts w:ascii="TH SarabunPSK" w:hAnsi="TH SarabunPSK" w:cs="TH SarabunPSK" w:hint="cs"/>
+                <w:sz w:val="32"/>
+                <w:szCs w:val="32"/>
+                <w:cs/>
+                <w:lang w:bidi="th-TH"/>
+              </w:rPr>
+              <w:t>เช่นเดิม และมีการแสดงข้อความ “</w:t>
+            </w:r>
+            <w:r>
+              <w:rPr>
+                <w:rFonts w:ascii="TH SarabunPSK" w:hAnsi="TH SarabunPSK" w:cs="TH SarabunPSK" w:hint="cs"/>
+                <w:sz w:val="32"/>
+                <w:szCs w:val="32"/>
+                <w:lang w:bidi="th-TH"/>
+              </w:rPr>
+              <w:t>Please enter your name</w:t>
+            </w:r>
+            <w:r>
+              <w:rPr>
+                <w:rFonts w:ascii="TH SarabunPSK" w:hAnsi="TH SarabunPSK" w:cs="TH SarabunPSK" w:hint="cs"/>
+                <w:sz w:val="32"/>
+                <w:szCs w:val="32"/>
+                <w:cs/>
+                <w:lang w:bidi="th-TH"/>
+              </w:rPr>
+              <w:t>!!”</w:t>
+            </w:r>
           </w:p>
         </w:tc>
         <w:tc>
@@ -10762,13 +11903,64 @@
           </w:tcPr>
           <w:p>
             <w:pPr>
-              <w:rPr>
-                <w:rFonts w:ascii="TH SarabunPSK" w:hAnsi="TH SarabunPSK" w:cs="TH SarabunPSK"/>
-                <w:sz w:val="32"/>
-                <w:szCs w:val="32"/>
-                <w:lang w:bidi="th-TH"/>
-              </w:rPr>
-            </w:pPr>
+              <w:jc w:val="center"/>
+              <w:rPr>
+                <w:rFonts w:ascii="TH SarabunPSK" w:hAnsi="TH SarabunPSK" w:cs="TH SarabunPSK"/>
+                <w:sz w:val="32"/>
+                <w:szCs w:val="32"/>
+                <w:lang w:bidi="th-TH"/>
+              </w:rPr>
+            </w:pPr>
+            <w:r>
+              <w:rPr>
+                <w:rFonts w:ascii="TH SarabunPSK" w:hAnsi="TH SarabunPSK" w:cs="TH SarabunPSK" w:hint="cs"/>
+                <w:noProof/>
+                <w:sz w:val="32"/>
+                <w:szCs w:val="32"/>
+                <w:lang w:bidi="th-TH"/>
+              </w:rPr>
+              <w:drawing>
+                <wp:inline distT="0" distB="0" distL="0" distR="0" wp14:anchorId="31BB89AB" wp14:editId="029D45A2">
+                  <wp:extent cx="201761" cy="191069"/>
+                  <wp:effectExtent l="0" t="0" r="8255" b="0"/>
+                  <wp:docPr id="518053366" name="Picture 518053366"/>
+                  <wp:cNvGraphicFramePr>
+                    <a:graphicFrameLocks xmlns:a="http://schemas.openxmlformats.org/drawingml/2006/main" noChangeAspect="1"/>
+                  </wp:cNvGraphicFramePr>
+                  <a:graphic xmlns:a="http://schemas.openxmlformats.org/drawingml/2006/main">
+                    <a:graphicData uri="http://schemas.openxmlformats.org/drawingml/2006/picture">
+                      <pic:pic xmlns:pic="http://schemas.openxmlformats.org/drawingml/2006/picture">
+                        <pic:nvPicPr>
+                          <pic:cNvPr id="1" name="th[1].png"/>
+                          <pic:cNvPicPr/>
+                        </pic:nvPicPr>
+                        <pic:blipFill>
+                          <a:blip r:embed="rId8" cstate="print">
+                            <a:extLst>
+                              <a:ext uri="{28A0092B-C50C-407E-A947-70E740481C1C}">
+                                <a14:useLocalDpi xmlns:a14="http://schemas.microsoft.com/office/drawing/2010/main" val="0"/>
+                              </a:ext>
+                            </a:extLst>
+                          </a:blip>
+                          <a:stretch>
+                            <a:fillRect/>
+                          </a:stretch>
+                        </pic:blipFill>
+                        <pic:spPr>
+                          <a:xfrm>
+                            <a:off x="0" y="0"/>
+                            <a:ext cx="214886" cy="203498"/>
+                          </a:xfrm>
+                          <a:prstGeom prst="rect">
+                            <a:avLst/>
+                          </a:prstGeom>
+                        </pic:spPr>
+                      </pic:pic>
+                    </a:graphicData>
+                  </a:graphic>
+                </wp:inline>
+              </w:drawing>
+            </w:r>
           </w:p>
         </w:tc>
         <w:tc>
@@ -11371,6 +12563,63 @@
                 <w:lang w:bidi="th-TH"/>
               </w:rPr>
             </w:pPr>
+            <w:r>
+              <w:rPr>
+                <w:rFonts w:ascii="TH SarabunPSK" w:hAnsi="TH SarabunPSK" w:cs="TH SarabunPSK" w:hint="cs"/>
+                <w:sz w:val="32"/>
+                <w:szCs w:val="32"/>
+                <w:cs/>
+                <w:lang w:bidi="th-TH"/>
+              </w:rPr>
+              <w:t xml:space="preserve">อยู่ที่หน้า </w:t>
+            </w:r>
+            <w:r>
+              <w:rPr>
+                <w:rFonts w:ascii="TH SarabunPSK" w:hAnsi="TH SarabunPSK" w:cs="TH SarabunPSK"/>
+                <w:sz w:val="32"/>
+                <w:szCs w:val="32"/>
+                <w:lang w:bidi="th-TH"/>
+              </w:rPr>
+              <w:t>Workshop</w:t>
+            </w:r>
+            <w:r>
+              <w:rPr>
+                <w:rFonts w:ascii="TH SarabunPSK" w:hAnsi="TH SarabunPSK" w:cs="TH SarabunPSK" w:hint="cs"/>
+                <w:sz w:val="32"/>
+                <w:szCs w:val="32"/>
+                <w:lang w:bidi="th-TH"/>
+              </w:rPr>
+              <w:t xml:space="preserve"> Registration </w:t>
+            </w:r>
+            <w:r>
+              <w:rPr>
+                <w:rFonts w:ascii="TH SarabunPSK" w:hAnsi="TH SarabunPSK" w:cs="TH SarabunPSK" w:hint="cs"/>
+                <w:sz w:val="32"/>
+                <w:szCs w:val="32"/>
+                <w:cs/>
+                <w:lang w:bidi="th-TH"/>
+              </w:rPr>
+              <w:t>เช่นเดิม และมีการแสดงข้อความ “</w:t>
+            </w:r>
+            <w:r>
+              <w:rPr>
+                <w:rFonts w:ascii="TH SarabunPSK" w:hAnsi="TH SarabunPSK" w:cs="TH SarabunPSK" w:hint="cs"/>
+                <w:sz w:val="32"/>
+                <w:szCs w:val="32"/>
+                <w:lang w:bidi="th-TH"/>
+              </w:rPr>
+              <w:t>Please enter your email</w:t>
+            </w:r>
+            <w:r>
+              <w:rPr>
+                <w:rFonts w:ascii="TH SarabunPSK" w:hAnsi="TH SarabunPSK" w:cs="TH SarabunPSK" w:hint="cs"/>
+                <w:sz w:val="32"/>
+                <w:szCs w:val="32"/>
+                <w:cs/>
+                <w:lang w:bidi="th-TH"/>
+              </w:rPr>
+              <w:t>!!”</w:t>
+            </w:r>
           </w:p>
         </w:tc>
         <w:tc>
@@ -11379,13 +12628,64 @@
           </w:tcPr>
           <w:p>
             <w:pPr>
-              <w:rPr>
-                <w:rFonts w:ascii="TH SarabunPSK" w:hAnsi="TH SarabunPSK" w:cs="TH SarabunPSK"/>
-                <w:sz w:val="32"/>
-                <w:szCs w:val="32"/>
-                <w:lang w:bidi="th-TH"/>
-              </w:rPr>
-            </w:pPr>
+              <w:jc w:val="center"/>
+              <w:rPr>
+                <w:rFonts w:ascii="TH SarabunPSK" w:hAnsi="TH SarabunPSK" w:cs="TH SarabunPSK"/>
+                <w:sz w:val="32"/>
+                <w:szCs w:val="32"/>
+                <w:lang w:bidi="th-TH"/>
+              </w:rPr>
+            </w:pPr>
+            <w:r>
+              <w:rPr>
+                <w:rFonts w:ascii="TH SarabunPSK" w:hAnsi="TH SarabunPSK" w:cs="TH SarabunPSK" w:hint="cs"/>
+                <w:noProof/>
+                <w:sz w:val="32"/>
+                <w:szCs w:val="32"/>
+                <w:lang w:bidi="th-TH"/>
+              </w:rPr>
+              <w:drawing>
+                <wp:inline distT="0" distB="0" distL="0" distR="0" wp14:anchorId="5D9A400C" wp14:editId="0197E588">
+                  <wp:extent cx="201761" cy="191069"/>
+                  <wp:effectExtent l="0" t="0" r="8255" b="0"/>
+                  <wp:docPr id="466638856" name="Picture 466638856"/>
+                  <wp:cNvGraphicFramePr>
+                    <a:graphicFrameLocks xmlns:a="http://schemas.openxmlformats.org/drawingml/2006/main" noChangeAspect="1"/>
+                  </wp:cNvGraphicFramePr>
+                  <a:graphic xmlns:a="http://schemas.openxmlformats.org/drawingml/2006/main">
+                    <a:graphicData uri="http://schemas.openxmlformats.org/drawingml/2006/picture">
+                      <pic:pic xmlns:pic="http://schemas.openxmlformats.org/drawingml/2006/picture">
+                        <pic:nvPicPr>
+                          <pic:cNvPr id="1" name="th[1].png"/>
+                          <pic:cNvPicPr/>
+                        </pic:nvPicPr>
+                        <pic:blipFill>
+                          <a:blip r:embed="rId8" cstate="print">
+                            <a:extLst>
+                              <a:ext uri="{28A0092B-C50C-407E-A947-70E740481C1C}">
+                                <a14:useLocalDpi xmlns:a14="http://schemas.microsoft.com/office/drawing/2010/main" val="0"/>
+                              </a:ext>
+                            </a:extLst>
+                          </a:blip>
+                          <a:stretch>
+                            <a:fillRect/>
+                          </a:stretch>
+                        </pic:blipFill>
+                        <pic:spPr>
+                          <a:xfrm>
+                            <a:off x="0" y="0"/>
+                            <a:ext cx="214886" cy="203498"/>
+                          </a:xfrm>
+                          <a:prstGeom prst="rect">
+                            <a:avLst/>
+                          </a:prstGeom>
+                        </pic:spPr>
+                      </pic:pic>
+                    </a:graphicData>
+                  </a:graphic>
+                </wp:inline>
+              </w:drawing>
+            </w:r>
           </w:p>
         </w:tc>
         <w:tc>
@@ -11904,16 +13204,7 @@
                 <w:szCs w:val="32"/>
                 <w:lang w:bidi="th-TH"/>
               </w:rPr>
-              <w:t xml:space="preserve"> </w:t>
-            </w:r>
-            <w:r>
-              <w:rPr>
-                <w:rFonts w:ascii="TH SarabunPSK" w:hAnsi="TH SarabunPSK" w:cs="TH SarabunPSK" w:hint="cs"/>
-                <w:sz w:val="32"/>
-                <w:szCs w:val="32"/>
-                <w:lang w:bidi="th-TH"/>
-              </w:rPr>
-              <w:t>Registration</w:t>
+              <w:t xml:space="preserve"> Registration</w:t>
             </w:r>
           </w:p>
         </w:tc>
@@ -11931,6 +13222,34 @@
                 <w:lang w:bidi="th-TH"/>
               </w:rPr>
             </w:pPr>
+            <w:r>
+              <w:rPr>
+                <w:rFonts w:ascii="TH SarabunPSK" w:hAnsi="TH SarabunPSK" w:cs="TH SarabunPSK" w:hint="cs"/>
+                <w:sz w:val="32"/>
+                <w:szCs w:val="32"/>
+                <w:cs/>
+                <w:lang w:bidi="th-TH"/>
+              </w:rPr>
+              <w:t xml:space="preserve">แสดงหน้า </w:t>
+            </w:r>
+            <w:r>
+              <w:rPr>
+                <w:rFonts w:ascii="TH SarabunPSK" w:hAnsi="TH SarabunPSK" w:cs="TH SarabunPSK"/>
+                <w:sz w:val="32"/>
+                <w:szCs w:val="32"/>
+                <w:lang w:bidi="th-TH"/>
+              </w:rPr>
+              <w:t>Workshop</w:t>
+            </w:r>
+            <w:r>
+              <w:rPr>
+                <w:rFonts w:ascii="TH SarabunPSK" w:hAnsi="TH SarabunPSK" w:cs="TH SarabunPSK" w:hint="cs"/>
+                <w:sz w:val="32"/>
+                <w:szCs w:val="32"/>
+                <w:lang w:bidi="th-TH"/>
+              </w:rPr>
+              <w:t xml:space="preserve"> Registration</w:t>
+            </w:r>
           </w:p>
         </w:tc>
         <w:tc>
@@ -11939,13 +13258,64 @@
           </w:tcPr>
           <w:p>
             <w:pPr>
-              <w:rPr>
-                <w:rFonts w:ascii="TH SarabunPSK" w:hAnsi="TH SarabunPSK" w:cs="TH SarabunPSK"/>
-                <w:sz w:val="32"/>
-                <w:szCs w:val="32"/>
-                <w:lang w:bidi="th-TH"/>
-              </w:rPr>
-            </w:pPr>
+              <w:jc w:val="center"/>
+              <w:rPr>
+                <w:rFonts w:ascii="TH SarabunPSK" w:hAnsi="TH SarabunPSK" w:cs="TH SarabunPSK"/>
+                <w:sz w:val="32"/>
+                <w:szCs w:val="32"/>
+                <w:lang w:bidi="th-TH"/>
+              </w:rPr>
+            </w:pPr>
+            <w:r>
+              <w:rPr>
+                <w:rFonts w:ascii="TH SarabunPSK" w:hAnsi="TH SarabunPSK" w:cs="TH SarabunPSK" w:hint="cs"/>
+                <w:noProof/>
+                <w:sz w:val="32"/>
+                <w:szCs w:val="32"/>
+                <w:lang w:bidi="th-TH"/>
+              </w:rPr>
+              <w:drawing>
+                <wp:inline distT="0" distB="0" distL="0" distR="0" wp14:anchorId="3DE2E45A" wp14:editId="445F2763">
+                  <wp:extent cx="201761" cy="191069"/>
+                  <wp:effectExtent l="0" t="0" r="8255" b="0"/>
+                  <wp:docPr id="2137963250" name="Picture 2137963250"/>
+                  <wp:cNvGraphicFramePr>
+                    <a:graphicFrameLocks xmlns:a="http://schemas.openxmlformats.org/drawingml/2006/main" noChangeAspect="1"/>
+                  </wp:cNvGraphicFramePr>
+                  <a:graphic xmlns:a="http://schemas.openxmlformats.org/drawingml/2006/main">
+                    <a:graphicData uri="http://schemas.openxmlformats.org/drawingml/2006/picture">
+                      <pic:pic xmlns:pic="http://schemas.openxmlformats.org/drawingml/2006/picture">
+                        <pic:nvPicPr>
+                          <pic:cNvPr id="1" name="th[1].png"/>
+                          <pic:cNvPicPr/>
+                        </pic:nvPicPr>
+                        <pic:blipFill>
+                          <a:blip r:embed="rId8" cstate="print">
+                            <a:extLst>
+                              <a:ext uri="{28A0092B-C50C-407E-A947-70E740481C1C}">
+                                <a14:useLocalDpi xmlns:a14="http://schemas.microsoft.com/office/drawing/2010/main" val="0"/>
+                              </a:ext>
+                            </a:extLst>
+                          </a:blip>
+                          <a:stretch>
+                            <a:fillRect/>
+                          </a:stretch>
+                        </pic:blipFill>
+                        <pic:spPr>
+                          <a:xfrm>
+                            <a:off x="0" y="0"/>
+                            <a:ext cx="214886" cy="203498"/>
+                          </a:xfrm>
+                          <a:prstGeom prst="rect">
+                            <a:avLst/>
+                          </a:prstGeom>
+                        </pic:spPr>
+                      </pic:pic>
+                    </a:graphicData>
+                  </a:graphic>
+                </wp:inline>
+              </w:drawing>
+            </w:r>
           </w:p>
         </w:tc>
         <w:tc>
@@ -12290,7 +13660,6 @@
                 <w:cs/>
                 <w:lang w:bidi="th-TH"/>
               </w:rPr>
-              <w:lastRenderedPageBreak/>
               <w:t xml:space="preserve">กรอกข้อมูลที่ช่อง </w:t>
             </w:r>
             <w:r>
@@ -12438,7 +13807,6 @@
                 <w:cs/>
                 <w:lang w:bidi="th-TH"/>
               </w:rPr>
-              <w:lastRenderedPageBreak/>
               <w:t xml:space="preserve">อยู่ที่หน้า </w:t>
             </w:r>
             <w:r>
@@ -12504,6 +13872,63 @@
                 <w:lang w:bidi="th-TH"/>
               </w:rPr>
             </w:pPr>
+            <w:r>
+              <w:rPr>
+                <w:rFonts w:ascii="TH SarabunPSK" w:hAnsi="TH SarabunPSK" w:cs="TH SarabunPSK" w:hint="cs"/>
+                <w:sz w:val="32"/>
+                <w:szCs w:val="32"/>
+                <w:cs/>
+                <w:lang w:bidi="th-TH"/>
+              </w:rPr>
+              <w:t xml:space="preserve">อยู่ที่หน้า </w:t>
+            </w:r>
+            <w:r>
+              <w:rPr>
+                <w:rFonts w:ascii="TH SarabunPSK" w:hAnsi="TH SarabunPSK" w:cs="TH SarabunPSK"/>
+                <w:sz w:val="32"/>
+                <w:szCs w:val="32"/>
+                <w:lang w:bidi="th-TH"/>
+              </w:rPr>
+              <w:t>Workshop</w:t>
+            </w:r>
+            <w:r>
+              <w:rPr>
+                <w:rFonts w:ascii="TH SarabunPSK" w:hAnsi="TH SarabunPSK" w:cs="TH SarabunPSK" w:hint="cs"/>
+                <w:sz w:val="32"/>
+                <w:szCs w:val="32"/>
+                <w:lang w:bidi="th-TH"/>
+              </w:rPr>
+              <w:t xml:space="preserve"> Registration </w:t>
+            </w:r>
+            <w:r>
+              <w:rPr>
+                <w:rFonts w:ascii="TH SarabunPSK" w:hAnsi="TH SarabunPSK" w:cs="TH SarabunPSK" w:hint="cs"/>
+                <w:sz w:val="32"/>
+                <w:szCs w:val="32"/>
+                <w:cs/>
+                <w:lang w:bidi="th-TH"/>
+              </w:rPr>
+              <w:t>เช่นเดิม และมีการแสดงข้อความ “</w:t>
+            </w:r>
+            <w:r>
+              <w:rPr>
+                <w:rFonts w:ascii="TH SarabunPSK" w:hAnsi="TH SarabunPSK" w:cs="TH SarabunPSK" w:hint="cs"/>
+                <w:sz w:val="32"/>
+                <w:szCs w:val="32"/>
+                <w:lang w:bidi="th-TH"/>
+              </w:rPr>
+              <w:t>Please enter your phone number</w:t>
+            </w:r>
+            <w:r>
+              <w:rPr>
+                <w:rFonts w:ascii="TH SarabunPSK" w:hAnsi="TH SarabunPSK" w:cs="TH SarabunPSK" w:hint="cs"/>
+                <w:sz w:val="32"/>
+                <w:szCs w:val="32"/>
+                <w:cs/>
+                <w:lang w:bidi="th-TH"/>
+              </w:rPr>
+              <w:t>!!”</w:t>
+            </w:r>
           </w:p>
         </w:tc>
         <w:tc>
@@ -12512,13 +13937,64 @@
           </w:tcPr>
           <w:p>
             <w:pPr>
-              <w:rPr>
-                <w:rFonts w:ascii="TH SarabunPSK" w:hAnsi="TH SarabunPSK" w:cs="TH SarabunPSK"/>
-                <w:sz w:val="32"/>
-                <w:szCs w:val="32"/>
-                <w:lang w:bidi="th-TH"/>
-              </w:rPr>
-            </w:pPr>
+              <w:jc w:val="center"/>
+              <w:rPr>
+                <w:rFonts w:ascii="TH SarabunPSK" w:hAnsi="TH SarabunPSK" w:cs="TH SarabunPSK"/>
+                <w:sz w:val="32"/>
+                <w:szCs w:val="32"/>
+                <w:lang w:bidi="th-TH"/>
+              </w:rPr>
+            </w:pPr>
+            <w:r>
+              <w:rPr>
+                <w:rFonts w:ascii="TH SarabunPSK" w:hAnsi="TH SarabunPSK" w:cs="TH SarabunPSK" w:hint="cs"/>
+                <w:noProof/>
+                <w:sz w:val="32"/>
+                <w:szCs w:val="32"/>
+                <w:lang w:bidi="th-TH"/>
+              </w:rPr>
+              <w:drawing>
+                <wp:inline distT="0" distB="0" distL="0" distR="0" wp14:anchorId="610B99A5" wp14:editId="15123299">
+                  <wp:extent cx="201761" cy="191069"/>
+                  <wp:effectExtent l="0" t="0" r="8255" b="0"/>
+                  <wp:docPr id="1692088515" name="Picture 1692088515"/>
+                  <wp:cNvGraphicFramePr>
+                    <a:graphicFrameLocks xmlns:a="http://schemas.openxmlformats.org/drawingml/2006/main" noChangeAspect="1"/>
+                  </wp:cNvGraphicFramePr>
+                  <a:graphic xmlns:a="http://schemas.openxmlformats.org/drawingml/2006/main">
+                    <a:graphicData uri="http://schemas.openxmlformats.org/drawingml/2006/picture">
+                      <pic:pic xmlns:pic="http://schemas.openxmlformats.org/drawingml/2006/picture">
+                        <pic:nvPicPr>
+                          <pic:cNvPr id="1" name="th[1].png"/>
+                          <pic:cNvPicPr/>
+                        </pic:nvPicPr>
+                        <pic:blipFill>
+                          <a:blip r:embed="rId8" cstate="print">
+                            <a:extLst>
+                              <a:ext uri="{28A0092B-C50C-407E-A947-70E740481C1C}">
+                                <a14:useLocalDpi xmlns:a14="http://schemas.microsoft.com/office/drawing/2010/main" val="0"/>
+                              </a:ext>
+                            </a:extLst>
+                          </a:blip>
+                          <a:stretch>
+                            <a:fillRect/>
+                          </a:stretch>
+                        </pic:blipFill>
+                        <pic:spPr>
+                          <a:xfrm>
+                            <a:off x="0" y="0"/>
+                            <a:ext cx="214886" cy="203498"/>
+                          </a:xfrm>
+                          <a:prstGeom prst="rect">
+                            <a:avLst/>
+                          </a:prstGeom>
+                        </pic:spPr>
+                      </pic:pic>
+                    </a:graphicData>
+                  </a:graphic>
+                </wp:inline>
+              </w:drawing>
+            </w:r>
           </w:p>
         </w:tc>
         <w:tc>
@@ -13037,16 +14513,7 @@
                 <w:szCs w:val="32"/>
                 <w:lang w:bidi="th-TH"/>
               </w:rPr>
-              <w:t xml:space="preserve"> </w:t>
-            </w:r>
-            <w:r>
-              <w:rPr>
-                <w:rFonts w:ascii="TH SarabunPSK" w:hAnsi="TH SarabunPSK" w:cs="TH SarabunPSK" w:hint="cs"/>
-                <w:sz w:val="32"/>
-                <w:szCs w:val="32"/>
-                <w:lang w:bidi="th-TH"/>
-              </w:rPr>
-              <w:t>Registration</w:t>
+              <w:t xml:space="preserve"> Registration</w:t>
             </w:r>
           </w:p>
         </w:tc>
@@ -13064,6 +14531,34 @@
                 <w:lang w:bidi="th-TH"/>
               </w:rPr>
             </w:pPr>
+            <w:r>
+              <w:rPr>
+                <w:rFonts w:ascii="TH SarabunPSK" w:hAnsi="TH SarabunPSK" w:cs="TH SarabunPSK" w:hint="cs"/>
+                <w:sz w:val="32"/>
+                <w:szCs w:val="32"/>
+                <w:cs/>
+                <w:lang w:bidi="th-TH"/>
+              </w:rPr>
+              <w:t xml:space="preserve">แสดงหน้า </w:t>
+            </w:r>
+            <w:r>
+              <w:rPr>
+                <w:rFonts w:ascii="TH SarabunPSK" w:hAnsi="TH SarabunPSK" w:cs="TH SarabunPSK"/>
+                <w:sz w:val="32"/>
+                <w:szCs w:val="32"/>
+                <w:lang w:bidi="th-TH"/>
+              </w:rPr>
+              <w:t>Workshop</w:t>
+            </w:r>
+            <w:r>
+              <w:rPr>
+                <w:rFonts w:ascii="TH SarabunPSK" w:hAnsi="TH SarabunPSK" w:cs="TH SarabunPSK" w:hint="cs"/>
+                <w:sz w:val="32"/>
+                <w:szCs w:val="32"/>
+                <w:lang w:bidi="th-TH"/>
+              </w:rPr>
+              <w:t xml:space="preserve"> Registration</w:t>
+            </w:r>
           </w:p>
         </w:tc>
         <w:tc>
@@ -13072,13 +14567,64 @@
           </w:tcPr>
           <w:p>
             <w:pPr>
-              <w:rPr>
-                <w:rFonts w:ascii="TH SarabunPSK" w:hAnsi="TH SarabunPSK" w:cs="TH SarabunPSK"/>
-                <w:sz w:val="32"/>
-                <w:szCs w:val="32"/>
-                <w:lang w:bidi="th-TH"/>
-              </w:rPr>
-            </w:pPr>
+              <w:jc w:val="center"/>
+              <w:rPr>
+                <w:rFonts w:ascii="TH SarabunPSK" w:hAnsi="TH SarabunPSK" w:cs="TH SarabunPSK"/>
+                <w:sz w:val="32"/>
+                <w:szCs w:val="32"/>
+                <w:lang w:bidi="th-TH"/>
+              </w:rPr>
+            </w:pPr>
+            <w:r>
+              <w:rPr>
+                <w:rFonts w:ascii="TH SarabunPSK" w:hAnsi="TH SarabunPSK" w:cs="TH SarabunPSK" w:hint="cs"/>
+                <w:noProof/>
+                <w:sz w:val="32"/>
+                <w:szCs w:val="32"/>
+                <w:lang w:bidi="th-TH"/>
+              </w:rPr>
+              <w:drawing>
+                <wp:inline distT="0" distB="0" distL="0" distR="0" wp14:anchorId="4571302F" wp14:editId="22524328">
+                  <wp:extent cx="201761" cy="191069"/>
+                  <wp:effectExtent l="0" t="0" r="8255" b="0"/>
+                  <wp:docPr id="764594892" name="Picture 764594892"/>
+                  <wp:cNvGraphicFramePr>
+                    <a:graphicFrameLocks xmlns:a="http://schemas.openxmlformats.org/drawingml/2006/main" noChangeAspect="1"/>
+                  </wp:cNvGraphicFramePr>
+                  <a:graphic xmlns:a="http://schemas.openxmlformats.org/drawingml/2006/main">
+                    <a:graphicData uri="http://schemas.openxmlformats.org/drawingml/2006/picture">
+                      <pic:pic xmlns:pic="http://schemas.openxmlformats.org/drawingml/2006/picture">
+                        <pic:nvPicPr>
+                          <pic:cNvPr id="1" name="th[1].png"/>
+                          <pic:cNvPicPr/>
+                        </pic:nvPicPr>
+                        <pic:blipFill>
+                          <a:blip r:embed="rId8" cstate="print">
+                            <a:extLst>
+                              <a:ext uri="{28A0092B-C50C-407E-A947-70E740481C1C}">
+                                <a14:useLocalDpi xmlns:a14="http://schemas.microsoft.com/office/drawing/2010/main" val="0"/>
+                              </a:ext>
+                            </a:extLst>
+                          </a:blip>
+                          <a:stretch>
+                            <a:fillRect/>
+                          </a:stretch>
+                        </pic:blipFill>
+                        <pic:spPr>
+                          <a:xfrm>
+                            <a:off x="0" y="0"/>
+                            <a:ext cx="214886" cy="203498"/>
+                          </a:xfrm>
+                          <a:prstGeom prst="rect">
+                            <a:avLst/>
+                          </a:prstGeom>
+                        </pic:spPr>
+                      </pic:pic>
+                    </a:graphicData>
+                  </a:graphic>
+                </wp:inline>
+              </w:drawing>
+            </w:r>
           </w:p>
         </w:tc>
         <w:tc>
@@ -13669,34 +15215,7 @@
                 <w:szCs w:val="32"/>
                 <w:lang w:bidi="th-TH"/>
               </w:rPr>
-              <w:t>Ple</w:t>
-            </w:r>
-            <w:r>
-              <w:rPr>
-                <w:rFonts w:ascii="TH SarabunPSK" w:hAnsi="TH SarabunPSK" w:cs="TH SarabunPSK" w:hint="cs"/>
-                <w:sz w:val="32"/>
-                <w:szCs w:val="32"/>
-                <w:lang w:bidi="th-TH"/>
-              </w:rPr>
-              <w:t>ase enter a valid phone number</w:t>
-            </w:r>
-            <w:r>
-              <w:rPr>
-                <w:rFonts w:ascii="TH SarabunPSK" w:hAnsi="TH SarabunPSK" w:cs="TH SarabunPSK" w:hint="cs"/>
-                <w:sz w:val="32"/>
-                <w:szCs w:val="32"/>
-                <w:lang w:bidi="th-TH"/>
-              </w:rPr>
-              <w:t xml:space="preserve">, </w:t>
-            </w:r>
-            <w:r>
-              <w:rPr>
-                <w:rFonts w:ascii="TH SarabunPSK" w:hAnsi="TH SarabunPSK" w:cs="TH SarabunPSK" w:hint="cs"/>
-                <w:sz w:val="32"/>
-                <w:szCs w:val="32"/>
-                <w:lang w:bidi="th-TH"/>
-              </w:rPr>
-              <w:t>e</w:t>
+              <w:t>Please enter a valid phone number, e</w:t>
             </w:r>
             <w:r>
               <w:rPr>
@@ -13734,16 +15253,7 @@
                 <w:szCs w:val="32"/>
                 <w:lang w:bidi="th-TH"/>
               </w:rPr>
-              <w:t>,</w:t>
-            </w:r>
-            <w:r>
-              <w:rPr>
-                <w:rFonts w:ascii="TH SarabunPSK" w:hAnsi="TH SarabunPSK" w:cs="TH SarabunPSK" w:hint="cs"/>
-                <w:sz w:val="32"/>
-                <w:szCs w:val="32"/>
-                <w:lang w:bidi="th-TH"/>
-              </w:rPr>
-              <w:t xml:space="preserve"> 081</w:t>
+              <w:t>, 081</w:t>
             </w:r>
             <w:r>
               <w:rPr>
@@ -13829,17 +15339,7 @@
                 <w:cs/>
                 <w:lang w:bidi="th-TH"/>
               </w:rPr>
-              <w:t>)</w:t>
-            </w:r>
-            <w:r>
-              <w:rPr>
-                <w:rFonts w:ascii="TH SarabunPSK" w:hAnsi="TH SarabunPSK" w:cs="TH SarabunPSK" w:hint="cs"/>
-                <w:sz w:val="32"/>
-                <w:szCs w:val="32"/>
-                <w:cs/>
-                <w:lang w:bidi="th-TH"/>
-              </w:rPr>
-              <w:t>”</w:t>
+              <w:t>)”</w:t>
             </w:r>
           </w:p>
         </w:tc>
@@ -13857,6 +15357,63 @@
                 <w:lang w:bidi="th-TH"/>
               </w:rPr>
             </w:pPr>
+            <w:r>
+              <w:rPr>
+                <w:rFonts w:ascii="TH SarabunPSK" w:hAnsi="TH SarabunPSK" w:cs="TH SarabunPSK" w:hint="cs"/>
+                <w:sz w:val="32"/>
+                <w:szCs w:val="32"/>
+                <w:cs/>
+                <w:lang w:bidi="th-TH"/>
+              </w:rPr>
+              <w:t xml:space="preserve">อยู่ที่หน้า </w:t>
+            </w:r>
+            <w:r>
+              <w:rPr>
+                <w:rFonts w:ascii="TH SarabunPSK" w:hAnsi="TH SarabunPSK" w:cs="TH SarabunPSK"/>
+                <w:sz w:val="32"/>
+                <w:szCs w:val="32"/>
+                <w:lang w:bidi="th-TH"/>
+              </w:rPr>
+              <w:t>Workshop</w:t>
+            </w:r>
+            <w:r>
+              <w:rPr>
+                <w:rFonts w:ascii="TH SarabunPSK" w:hAnsi="TH SarabunPSK" w:cs="TH SarabunPSK" w:hint="cs"/>
+                <w:sz w:val="32"/>
+                <w:szCs w:val="32"/>
+                <w:lang w:bidi="th-TH"/>
+              </w:rPr>
+              <w:t xml:space="preserve"> Registration </w:t>
+            </w:r>
+            <w:r>
+              <w:rPr>
+                <w:rFonts w:ascii="TH SarabunPSK" w:hAnsi="TH SarabunPSK" w:cs="TH SarabunPSK" w:hint="cs"/>
+                <w:sz w:val="32"/>
+                <w:szCs w:val="32"/>
+                <w:cs/>
+                <w:lang w:bidi="th-TH"/>
+              </w:rPr>
+              <w:t>เช่นเดิม และมีการแสดงข้อความ “</w:t>
+            </w:r>
+            <w:r>
+              <w:rPr>
+                <w:rFonts w:ascii="TH SarabunPSK" w:hAnsi="TH SarabunPSK" w:cs="TH SarabunPSK"/>
+                <w:sz w:val="32"/>
+                <w:szCs w:val="32"/>
+                <w:lang w:bidi="th-TH"/>
+              </w:rPr>
+              <w:t>Please enter a valid phone number!!</w:t>
+            </w:r>
+            <w:r>
+              <w:rPr>
+                <w:rFonts w:ascii="TH SarabunPSK" w:hAnsi="TH SarabunPSK" w:cs="TH SarabunPSK" w:hint="cs"/>
+                <w:sz w:val="32"/>
+                <w:szCs w:val="32"/>
+                <w:cs/>
+                <w:lang w:bidi="th-TH"/>
+              </w:rPr>
+              <w:t>”</w:t>
+            </w:r>
           </w:p>
         </w:tc>
         <w:tc>
@@ -13865,13 +15422,71 @@
           </w:tcPr>
           <w:p>
             <w:pPr>
-              <w:rPr>
-                <w:rFonts w:ascii="TH SarabunPSK" w:hAnsi="TH SarabunPSK" w:cs="TH SarabunPSK"/>
-                <w:sz w:val="32"/>
-                <w:szCs w:val="32"/>
-                <w:lang w:bidi="th-TH"/>
-              </w:rPr>
-            </w:pPr>
+              <w:jc w:val="center"/>
+              <w:rPr>
+                <w:rFonts w:ascii="TH SarabunPSK" w:hAnsi="TH SarabunPSK" w:cs="TH SarabunPSK"/>
+                <w:sz w:val="32"/>
+                <w:szCs w:val="32"/>
+                <w:lang w:bidi="th-TH"/>
+              </w:rPr>
+            </w:pPr>
+            <w:r>
+              <w:rPr>
+                <w:rFonts w:ascii="TH SarabunPSK" w:hAnsi="TH SarabunPSK" w:cs="TH SarabunPSK" w:hint="cs"/>
+                <w:noProof/>
+                <w:sz w:val="32"/>
+                <w:szCs w:val="32"/>
+                <w:lang w:bidi="th-TH"/>
+              </w:rPr>
+              <w:drawing>
+                <wp:inline distT="0" distB="0" distL="0" distR="0" wp14:anchorId="27D2E571" wp14:editId="60B8FA56">
+                  <wp:extent cx="216464" cy="190841"/>
+                  <wp:effectExtent l="0" t="0" r="0" b="0"/>
+                  <wp:docPr id="477750159" name="Picture 477750159"/>
+                  <wp:cNvGraphicFramePr>
+                    <a:graphicFrameLocks xmlns:a="http://schemas.openxmlformats.org/drawingml/2006/main" noChangeAspect="1"/>
+                  </wp:cNvGraphicFramePr>
+                  <a:graphic xmlns:a="http://schemas.openxmlformats.org/drawingml/2006/main">
+                    <a:graphicData uri="http://schemas.openxmlformats.org/drawingml/2006/picture">
+                      <pic:pic xmlns:pic="http://schemas.openxmlformats.org/drawingml/2006/picture">
+                        <pic:nvPicPr>
+                          <pic:cNvPr id="0" name="Picture 1"/>
+                          <pic:cNvPicPr>
+                            <a:picLocks noChangeAspect="1" noChangeArrowheads="1"/>
+                          </pic:cNvPicPr>
+                        </pic:nvPicPr>
+                        <pic:blipFill>
+                          <a:blip r:embed="rId9" cstate="print">
+                            <a:extLst>
+                              <a:ext uri="{28A0092B-C50C-407E-A947-70E740481C1C}">
+                                <a14:useLocalDpi xmlns:a14="http://schemas.microsoft.com/office/drawing/2010/main" val="0"/>
+                              </a:ext>
+                            </a:extLst>
+                          </a:blip>
+                          <a:srcRect/>
+                          <a:stretch>
+                            <a:fillRect/>
+                          </a:stretch>
+                        </pic:blipFill>
+                        <pic:spPr bwMode="auto">
+                          <a:xfrm>
+                            <a:off x="0" y="0"/>
+                            <a:ext cx="250653" cy="220983"/>
+                          </a:xfrm>
+                          <a:prstGeom prst="rect">
+                            <a:avLst/>
+                          </a:prstGeom>
+                          <a:noFill/>
+                          <a:ln>
+                            <a:noFill/>
+                          </a:ln>
+                        </pic:spPr>
+                      </pic:pic>
+                    </a:graphicData>
+                  </a:graphic>
+                </wp:inline>
+              </w:drawing>
+            </w:r>
           </w:p>
         </w:tc>
         <w:tc>
@@ -13887,6 +15502,44 @@
                 <w:lang w:bidi="th-TH"/>
               </w:rPr>
             </w:pPr>
+            <w:r>
+              <w:rPr>
+                <w:rFonts w:ascii="TH SarabunPSK" w:hAnsi="TH SarabunPSK" w:cs="TH SarabunPSK" w:hint="cs"/>
+                <w:sz w:val="32"/>
+                <w:szCs w:val="32"/>
+                <w:cs/>
+                <w:lang w:bidi="th-TH"/>
+              </w:rPr>
+              <w:t xml:space="preserve">การแสดงข้อความของ </w:t>
+            </w:r>
+            <w:r>
+              <w:rPr>
+                <w:rFonts w:ascii="TH SarabunPSK" w:hAnsi="TH SarabunPSK" w:cs="TH SarabunPSK"/>
+                <w:sz w:val="32"/>
+                <w:szCs w:val="32"/>
+                <w:lang w:bidi="th-TH"/>
+              </w:rPr>
+              <w:t>Actual Result</w:t>
+            </w:r>
+            <w:r>
+              <w:rPr>
+                <w:rFonts w:ascii="TH SarabunPSK" w:hAnsi="TH SarabunPSK" w:cs="TH SarabunPSK" w:hint="cs"/>
+                <w:sz w:val="32"/>
+                <w:szCs w:val="32"/>
+                <w:cs/>
+                <w:lang w:bidi="th-TH"/>
+              </w:rPr>
+              <w:t xml:space="preserve"> ไม่ตรงตาม </w:t>
+            </w:r>
+            <w:r>
+              <w:rPr>
+                <w:rFonts w:ascii="TH SarabunPSK" w:hAnsi="TH SarabunPSK" w:cs="TH SarabunPSK"/>
+                <w:sz w:val="32"/>
+                <w:szCs w:val="32"/>
+                <w:lang w:bidi="th-TH"/>
+              </w:rPr>
+              <w:t>Expected Result</w:t>
+            </w:r>
           </w:p>
         </w:tc>
       </w:tr>
@@ -13898,6 +15551,51 @@
           <w:rFonts w:ascii="TH SarabunPSK" w:hAnsi="TH SarabunPSK" w:cs="TH SarabunPSK"/>
           <w:sz w:val="32"/>
           <w:szCs w:val="32"/>
+          <w:lang w:bidi="th-TH"/>
+        </w:rPr>
+      </w:pPr>
+    </w:p>
+    <w:p>
+      <w:pPr>
+        <w:spacing w:before="240"/>
+        <w:rPr>
+          <w:rFonts w:ascii="TH SarabunPSK" w:hAnsi="TH SarabunPSK" w:cs="TH SarabunPSK"/>
+          <w:sz w:val="32"/>
+          <w:szCs w:val="32"/>
+          <w:lang w:bidi="th-TH"/>
+        </w:rPr>
+      </w:pPr>
+    </w:p>
+    <w:p>
+      <w:pPr>
+        <w:spacing w:before="240"/>
+        <w:rPr>
+          <w:rFonts w:ascii="TH SarabunPSK" w:hAnsi="TH SarabunPSK" w:cs="TH SarabunPSK"/>
+          <w:sz w:val="32"/>
+          <w:szCs w:val="32"/>
+          <w:lang w:bidi="th-TH"/>
+        </w:rPr>
+      </w:pPr>
+    </w:p>
+    <w:p>
+      <w:pPr>
+        <w:spacing w:before="240"/>
+        <w:rPr>
+          <w:rFonts w:ascii="TH SarabunPSK" w:hAnsi="TH SarabunPSK" w:cs="TH SarabunPSK"/>
+          <w:sz w:val="32"/>
+          <w:szCs w:val="32"/>
+          <w:lang w:bidi="th-TH"/>
+        </w:rPr>
+      </w:pPr>
+    </w:p>
+    <w:p>
+      <w:pPr>
+        <w:spacing w:before="240"/>
+        <w:rPr>
+          <w:rFonts w:ascii="TH SarabunPSK" w:hAnsi="TH SarabunPSK" w:cs="TH SarabunPSK" w:hint="cs"/>
+          <w:sz w:val="32"/>
+          <w:szCs w:val="32"/>
+          <w:cs/>
           <w:lang w:bidi="th-TH"/>
         </w:rPr>
       </w:pPr>
@@ -14364,13 +16062,23 @@
           </w:tcPr>
           <w:p>
             <w:pPr>
-              <w:rPr>
-                <w:rFonts w:ascii="TH SarabunPSK" w:hAnsi="TH SarabunPSK" w:cs="TH SarabunPSK"/>
-                <w:sz w:val="32"/>
-                <w:szCs w:val="32"/>
-                <w:lang w:bidi="th-TH"/>
-              </w:rPr>
-            </w:pPr>
+              <w:jc w:val="center"/>
+              <w:rPr>
+                <w:rFonts w:ascii="TH SarabunPSK" w:hAnsi="TH SarabunPSK" w:cs="TH SarabunPSK"/>
+                <w:sz w:val="32"/>
+                <w:szCs w:val="32"/>
+                <w:lang w:bidi="th-TH"/>
+              </w:rPr>
+            </w:pPr>
+            <w:r>
+              <w:rPr>
+                <w:rFonts w:ascii="TH SarabunPSK" w:hAnsi="TH SarabunPSK" w:cs="TH SarabunPSK"/>
+                <w:sz w:val="32"/>
+                <w:szCs w:val="32"/>
+                <w:lang w:bidi="th-TH"/>
+              </w:rPr>
+              <w:t>2</w:t>
+            </w:r>
           </w:p>
         </w:tc>
         <w:tc>
@@ -14379,13 +16087,23 @@
           </w:tcPr>
           <w:p>
             <w:pPr>
-              <w:rPr>
-                <w:rFonts w:ascii="TH SarabunPSK" w:hAnsi="TH SarabunPSK" w:cs="TH SarabunPSK"/>
-                <w:sz w:val="32"/>
-                <w:szCs w:val="32"/>
-                <w:lang w:bidi="th-TH"/>
-              </w:rPr>
-            </w:pPr>
+              <w:jc w:val="center"/>
+              <w:rPr>
+                <w:rFonts w:ascii="TH SarabunPSK" w:hAnsi="TH SarabunPSK" w:cs="TH SarabunPSK"/>
+                <w:sz w:val="32"/>
+                <w:szCs w:val="32"/>
+                <w:lang w:bidi="th-TH"/>
+              </w:rPr>
+            </w:pPr>
+            <w:r>
+              <w:rPr>
+                <w:rFonts w:ascii="TH SarabunPSK" w:hAnsi="TH SarabunPSK" w:cs="TH SarabunPSK"/>
+                <w:sz w:val="32"/>
+                <w:szCs w:val="32"/>
+                <w:lang w:bidi="th-TH"/>
+              </w:rPr>
+              <w:t>2</w:t>
+            </w:r>
           </w:p>
         </w:tc>
         <w:tc>
@@ -14394,13 +16112,23 @@
           </w:tcPr>
           <w:p>
             <w:pPr>
-              <w:rPr>
-                <w:rFonts w:ascii="TH SarabunPSK" w:hAnsi="TH SarabunPSK" w:cs="TH SarabunPSK"/>
-                <w:sz w:val="32"/>
-                <w:szCs w:val="32"/>
-                <w:lang w:bidi="th-TH"/>
-              </w:rPr>
-            </w:pPr>
+              <w:jc w:val="center"/>
+              <w:rPr>
+                <w:rFonts w:ascii="TH SarabunPSK" w:hAnsi="TH SarabunPSK" w:cs="TH SarabunPSK"/>
+                <w:sz w:val="32"/>
+                <w:szCs w:val="32"/>
+                <w:lang w:bidi="th-TH"/>
+              </w:rPr>
+            </w:pPr>
+            <w:r>
+              <w:rPr>
+                <w:rFonts w:ascii="TH SarabunPSK" w:hAnsi="TH SarabunPSK" w:cs="TH SarabunPSK"/>
+                <w:sz w:val="32"/>
+                <w:szCs w:val="32"/>
+                <w:lang w:bidi="th-TH"/>
+              </w:rPr>
+              <w:t>0</w:t>
+            </w:r>
           </w:p>
         </w:tc>
         <w:tc>
@@ -14409,13 +16137,23 @@
           </w:tcPr>
           <w:p>
             <w:pPr>
-              <w:rPr>
-                <w:rFonts w:ascii="TH SarabunPSK" w:hAnsi="TH SarabunPSK" w:cs="TH SarabunPSK"/>
-                <w:sz w:val="32"/>
-                <w:szCs w:val="32"/>
-                <w:lang w:bidi="th-TH"/>
-              </w:rPr>
-            </w:pPr>
+              <w:jc w:val="center"/>
+              <w:rPr>
+                <w:rFonts w:ascii="TH SarabunPSK" w:hAnsi="TH SarabunPSK" w:cs="TH SarabunPSK"/>
+                <w:sz w:val="32"/>
+                <w:szCs w:val="32"/>
+                <w:lang w:bidi="th-TH"/>
+              </w:rPr>
+            </w:pPr>
+            <w:r>
+              <w:rPr>
+                <w:rFonts w:ascii="TH SarabunPSK" w:hAnsi="TH SarabunPSK" w:cs="TH SarabunPSK"/>
+                <w:sz w:val="32"/>
+                <w:szCs w:val="32"/>
+                <w:lang w:bidi="th-TH"/>
+              </w:rPr>
+              <w:t>0</w:t>
+            </w:r>
           </w:p>
         </w:tc>
         <w:tc>
@@ -14424,13 +16162,23 @@
           </w:tcPr>
           <w:p>
             <w:pPr>
-              <w:rPr>
-                <w:rFonts w:ascii="TH SarabunPSK" w:hAnsi="TH SarabunPSK" w:cs="TH SarabunPSK"/>
-                <w:sz w:val="32"/>
-                <w:szCs w:val="32"/>
-                <w:lang w:bidi="th-TH"/>
-              </w:rPr>
-            </w:pPr>
+              <w:jc w:val="center"/>
+              <w:rPr>
+                <w:rFonts w:ascii="TH SarabunPSK" w:hAnsi="TH SarabunPSK" w:cs="TH SarabunPSK"/>
+                <w:sz w:val="32"/>
+                <w:szCs w:val="32"/>
+                <w:lang w:bidi="th-TH"/>
+              </w:rPr>
+            </w:pPr>
+            <w:r>
+              <w:rPr>
+                <w:rFonts w:ascii="TH SarabunPSK" w:hAnsi="TH SarabunPSK" w:cs="TH SarabunPSK"/>
+                <w:sz w:val="32"/>
+                <w:szCs w:val="32"/>
+                <w:lang w:bidi="th-TH"/>
+              </w:rPr>
+              <w:t>0</w:t>
+            </w:r>
           </w:p>
         </w:tc>
         <w:tc>
@@ -14439,13 +16187,23 @@
           </w:tcPr>
           <w:p>
             <w:pPr>
-              <w:rPr>
-                <w:rFonts w:ascii="TH SarabunPSK" w:hAnsi="TH SarabunPSK" w:cs="TH SarabunPSK"/>
-                <w:sz w:val="32"/>
-                <w:szCs w:val="32"/>
-                <w:lang w:bidi="th-TH"/>
-              </w:rPr>
-            </w:pPr>
+              <w:jc w:val="center"/>
+              <w:rPr>
+                <w:rFonts w:ascii="TH SarabunPSK" w:hAnsi="TH SarabunPSK" w:cs="TH SarabunPSK"/>
+                <w:sz w:val="32"/>
+                <w:szCs w:val="32"/>
+                <w:lang w:bidi="th-TH"/>
+              </w:rPr>
+            </w:pPr>
+            <w:r>
+              <w:rPr>
+                <w:rFonts w:ascii="TH SarabunPSK" w:hAnsi="TH SarabunPSK" w:cs="TH SarabunPSK"/>
+                <w:sz w:val="32"/>
+                <w:szCs w:val="32"/>
+                <w:lang w:bidi="th-TH"/>
+              </w:rPr>
+              <w:t>-</w:t>
+            </w:r>
           </w:p>
         </w:tc>
         <w:tc>
@@ -14454,13 +16212,23 @@
           </w:tcPr>
           <w:p>
             <w:pPr>
-              <w:rPr>
-                <w:rFonts w:ascii="TH SarabunPSK" w:hAnsi="TH SarabunPSK" w:cs="TH SarabunPSK"/>
-                <w:sz w:val="32"/>
-                <w:szCs w:val="32"/>
-                <w:lang w:bidi="th-TH"/>
-              </w:rPr>
-            </w:pPr>
+              <w:jc w:val="center"/>
+              <w:rPr>
+                <w:rFonts w:ascii="TH SarabunPSK" w:hAnsi="TH SarabunPSK" w:cs="TH SarabunPSK"/>
+                <w:sz w:val="32"/>
+                <w:szCs w:val="32"/>
+                <w:lang w:bidi="th-TH"/>
+              </w:rPr>
+            </w:pPr>
+            <w:r>
+              <w:rPr>
+                <w:rFonts w:ascii="TH SarabunPSK" w:hAnsi="TH SarabunPSK" w:cs="TH SarabunPSK"/>
+                <w:sz w:val="32"/>
+                <w:szCs w:val="32"/>
+                <w:lang w:bidi="th-TH"/>
+              </w:rPr>
+              <w:t>-</w:t>
+            </w:r>
           </w:p>
         </w:tc>
       </w:tr>
@@ -14616,13 +16384,23 @@
           </w:tcPr>
           <w:p>
             <w:pPr>
-              <w:rPr>
-                <w:rFonts w:ascii="TH SarabunPSK" w:hAnsi="TH SarabunPSK" w:cs="TH SarabunPSK"/>
-                <w:sz w:val="32"/>
-                <w:szCs w:val="32"/>
-                <w:lang w:bidi="th-TH"/>
-              </w:rPr>
-            </w:pPr>
+              <w:jc w:val="center"/>
+              <w:rPr>
+                <w:rFonts w:ascii="TH SarabunPSK" w:hAnsi="TH SarabunPSK" w:cs="TH SarabunPSK"/>
+                <w:sz w:val="32"/>
+                <w:szCs w:val="32"/>
+                <w:lang w:bidi="th-TH"/>
+              </w:rPr>
+            </w:pPr>
+            <w:r>
+              <w:rPr>
+                <w:rFonts w:ascii="TH SarabunPSK" w:hAnsi="TH SarabunPSK" w:cs="TH SarabunPSK"/>
+                <w:sz w:val="32"/>
+                <w:szCs w:val="32"/>
+                <w:lang w:bidi="th-TH"/>
+              </w:rPr>
+              <w:t>5</w:t>
+            </w:r>
           </w:p>
         </w:tc>
         <w:tc>
@@ -14634,13 +16412,23 @@
           </w:tcPr>
           <w:p>
             <w:pPr>
-              <w:rPr>
-                <w:rFonts w:ascii="TH SarabunPSK" w:hAnsi="TH SarabunPSK" w:cs="TH SarabunPSK"/>
-                <w:sz w:val="32"/>
-                <w:szCs w:val="32"/>
-                <w:lang w:bidi="th-TH"/>
-              </w:rPr>
-            </w:pPr>
+              <w:jc w:val="center"/>
+              <w:rPr>
+                <w:rFonts w:ascii="TH SarabunPSK" w:hAnsi="TH SarabunPSK" w:cs="TH SarabunPSK"/>
+                <w:sz w:val="32"/>
+                <w:szCs w:val="32"/>
+                <w:lang w:bidi="th-TH"/>
+              </w:rPr>
+            </w:pPr>
+            <w:r>
+              <w:rPr>
+                <w:rFonts w:ascii="TH SarabunPSK" w:hAnsi="TH SarabunPSK" w:cs="TH SarabunPSK"/>
+                <w:sz w:val="32"/>
+                <w:szCs w:val="32"/>
+                <w:lang w:bidi="th-TH"/>
+              </w:rPr>
+              <w:t>4</w:t>
+            </w:r>
           </w:p>
         </w:tc>
         <w:tc>
@@ -14652,13 +16440,23 @@
           </w:tcPr>
           <w:p>
             <w:pPr>
-              <w:rPr>
-                <w:rFonts w:ascii="TH SarabunPSK" w:hAnsi="TH SarabunPSK" w:cs="TH SarabunPSK"/>
-                <w:sz w:val="32"/>
-                <w:szCs w:val="32"/>
-                <w:lang w:bidi="th-TH"/>
-              </w:rPr>
-            </w:pPr>
+              <w:jc w:val="center"/>
+              <w:rPr>
+                <w:rFonts w:ascii="TH SarabunPSK" w:hAnsi="TH SarabunPSK" w:cs="TH SarabunPSK"/>
+                <w:sz w:val="32"/>
+                <w:szCs w:val="32"/>
+                <w:lang w:bidi="th-TH"/>
+              </w:rPr>
+            </w:pPr>
+            <w:r>
+              <w:rPr>
+                <w:rFonts w:ascii="TH SarabunPSK" w:hAnsi="TH SarabunPSK" w:cs="TH SarabunPSK"/>
+                <w:sz w:val="32"/>
+                <w:szCs w:val="32"/>
+                <w:lang w:bidi="th-TH"/>
+              </w:rPr>
+              <w:t>1</w:t>
+            </w:r>
           </w:p>
         </w:tc>
         <w:tc>
@@ -14670,13 +16468,23 @@
           </w:tcPr>
           <w:p>
             <w:pPr>
-              <w:rPr>
-                <w:rFonts w:ascii="TH SarabunPSK" w:hAnsi="TH SarabunPSK" w:cs="TH SarabunPSK"/>
-                <w:sz w:val="32"/>
-                <w:szCs w:val="32"/>
-                <w:lang w:bidi="th-TH"/>
-              </w:rPr>
-            </w:pPr>
+              <w:jc w:val="center"/>
+              <w:rPr>
+                <w:rFonts w:ascii="TH SarabunPSK" w:hAnsi="TH SarabunPSK" w:cs="TH SarabunPSK"/>
+                <w:sz w:val="32"/>
+                <w:szCs w:val="32"/>
+                <w:lang w:bidi="th-TH"/>
+              </w:rPr>
+            </w:pPr>
+            <w:r>
+              <w:rPr>
+                <w:rFonts w:ascii="TH SarabunPSK" w:hAnsi="TH SarabunPSK" w:cs="TH SarabunPSK"/>
+                <w:sz w:val="32"/>
+                <w:szCs w:val="32"/>
+                <w:lang w:bidi="th-TH"/>
+              </w:rPr>
+              <w:t>0</w:t>
+            </w:r>
           </w:p>
         </w:tc>
         <w:tc>
@@ -14688,13 +16496,23 @@
           </w:tcPr>
           <w:p>
             <w:pPr>
-              <w:rPr>
-                <w:rFonts w:ascii="TH SarabunPSK" w:hAnsi="TH SarabunPSK" w:cs="TH SarabunPSK"/>
-                <w:sz w:val="32"/>
-                <w:szCs w:val="32"/>
-                <w:lang w:bidi="th-TH"/>
-              </w:rPr>
-            </w:pPr>
+              <w:jc w:val="center"/>
+              <w:rPr>
+                <w:rFonts w:ascii="TH SarabunPSK" w:hAnsi="TH SarabunPSK" w:cs="TH SarabunPSK"/>
+                <w:sz w:val="32"/>
+                <w:szCs w:val="32"/>
+                <w:lang w:bidi="th-TH"/>
+              </w:rPr>
+            </w:pPr>
+            <w:r>
+              <w:rPr>
+                <w:rFonts w:ascii="TH SarabunPSK" w:hAnsi="TH SarabunPSK" w:cs="TH SarabunPSK"/>
+                <w:sz w:val="32"/>
+                <w:szCs w:val="32"/>
+                <w:lang w:bidi="th-TH"/>
+              </w:rPr>
+              <w:t>0</w:t>
+            </w:r>
           </w:p>
         </w:tc>
         <w:tc>
@@ -14707,12 +16525,98 @@
           <w:p>
             <w:pPr>
               <w:rPr>
-                <w:rFonts w:ascii="TH SarabunPSK" w:hAnsi="TH SarabunPSK" w:cs="TH SarabunPSK"/>
-                <w:sz w:val="32"/>
-                <w:szCs w:val="32"/>
-                <w:lang w:bidi="th-TH"/>
-              </w:rPr>
-            </w:pPr>
+                <w:rFonts w:ascii="TH SarabunPSK" w:hAnsi="TH SarabunPSK" w:cs="TH SarabunPSK" w:hint="cs"/>
+                <w:sz w:val="32"/>
+                <w:szCs w:val="32"/>
+                <w:lang w:bidi="th-TH"/>
+              </w:rPr>
+            </w:pPr>
+            <w:r>
+              <w:rPr>
+                <w:rFonts w:ascii="TH SarabunPSK" w:hAnsi="TH SarabunPSK" w:cs="TH SarabunPSK" w:hint="cs"/>
+                <w:sz w:val="32"/>
+                <w:szCs w:val="32"/>
+                <w:cs/>
+                <w:lang w:bidi="th-TH"/>
+              </w:rPr>
+              <w:t>ในการทดสอบใส่เบอร์โทรศัพท์ผิด</w:t>
+            </w:r>
+            <w:r>
+              <w:rPr>
+                <w:rFonts w:ascii="TH SarabunPSK" w:hAnsi="TH SarabunPSK" w:cs="TH SarabunPSK"/>
+                <w:sz w:val="32"/>
+                <w:szCs w:val="32"/>
+                <w:lang w:bidi="th-TH"/>
+              </w:rPr>
+              <w:t xml:space="preserve"> </w:t>
+            </w:r>
+            <w:r>
+              <w:rPr>
+                <w:rFonts w:ascii="TH SarabunPSK" w:hAnsi="TH SarabunPSK" w:cs="TH SarabunPSK" w:hint="cs"/>
+                <w:sz w:val="32"/>
+                <w:szCs w:val="32"/>
+                <w:cs/>
+                <w:lang w:bidi="th-TH"/>
+              </w:rPr>
+              <w:t>การ</w:t>
+            </w:r>
+            <w:r>
+              <w:rPr>
+                <w:rFonts w:ascii="TH SarabunPSK" w:hAnsi="TH SarabunPSK" w:cs="TH SarabunPSK" w:hint="cs"/>
+                <w:sz w:val="32"/>
+                <w:szCs w:val="32"/>
+                <w:cs/>
+                <w:lang w:bidi="th-TH"/>
+              </w:rPr>
+              <w:t>แสดงข้อความ</w:t>
+            </w:r>
+            <w:r>
+              <w:rPr>
+                <w:rFonts w:ascii="TH SarabunPSK" w:hAnsi="TH SarabunPSK" w:cs="TH SarabunPSK" w:hint="cs"/>
+                <w:sz w:val="32"/>
+                <w:szCs w:val="32"/>
+                <w:cs/>
+                <w:lang w:bidi="th-TH"/>
+              </w:rPr>
+              <w:t xml:space="preserve">ของ </w:t>
+            </w:r>
+            <w:r>
+              <w:rPr>
+                <w:rFonts w:ascii="TH SarabunPSK" w:hAnsi="TH SarabunPSK" w:cs="TH SarabunPSK"/>
+                <w:sz w:val="32"/>
+                <w:szCs w:val="32"/>
+                <w:lang w:bidi="th-TH"/>
+              </w:rPr>
+              <w:t>Actual Result</w:t>
+            </w:r>
+            <w:r>
+              <w:rPr>
+                <w:rFonts w:ascii="TH SarabunPSK" w:hAnsi="TH SarabunPSK" w:cs="TH SarabunPSK"/>
+                <w:sz w:val="32"/>
+                <w:szCs w:val="32"/>
+                <w:lang w:bidi="th-TH"/>
+              </w:rPr>
+              <w:t xml:space="preserve"> </w:t>
+            </w:r>
+            <w:r>
+              <w:rPr>
+                <w:rFonts w:ascii="TH SarabunPSK" w:hAnsi="TH SarabunPSK" w:cs="TH SarabunPSK" w:hint="cs"/>
+                <w:sz w:val="32"/>
+                <w:szCs w:val="32"/>
+                <w:cs/>
+                <w:lang w:bidi="th-TH"/>
+              </w:rPr>
+              <w:t xml:space="preserve">ไม่ตรงตาม </w:t>
+            </w:r>
+            <w:r>
+              <w:rPr>
+                <w:rFonts w:ascii="TH SarabunPSK" w:hAnsi="TH SarabunPSK" w:cs="TH SarabunPSK"/>
+                <w:sz w:val="32"/>
+                <w:szCs w:val="32"/>
+                <w:lang w:bidi="th-TH"/>
+              </w:rPr>
+              <w:t>Expected Result</w:t>
+            </w:r>
           </w:p>
         </w:tc>
         <w:tc>
@@ -14724,13 +16628,23 @@
           </w:tcPr>
           <w:p>
             <w:pPr>
-              <w:rPr>
-                <w:rFonts w:ascii="TH SarabunPSK" w:hAnsi="TH SarabunPSK" w:cs="TH SarabunPSK"/>
-                <w:sz w:val="32"/>
-                <w:szCs w:val="32"/>
-                <w:lang w:bidi="th-TH"/>
-              </w:rPr>
-            </w:pPr>
+              <w:jc w:val="center"/>
+              <w:rPr>
+                <w:rFonts w:ascii="TH SarabunPSK" w:hAnsi="TH SarabunPSK" w:cs="TH SarabunPSK"/>
+                <w:sz w:val="32"/>
+                <w:szCs w:val="32"/>
+                <w:lang w:bidi="th-TH"/>
+              </w:rPr>
+            </w:pPr>
+            <w:r>
+              <w:rPr>
+                <w:rFonts w:ascii="TH SarabunPSK" w:hAnsi="TH SarabunPSK" w:cs="TH SarabunPSK"/>
+                <w:sz w:val="32"/>
+                <w:szCs w:val="32"/>
+                <w:lang w:bidi="th-TH"/>
+              </w:rPr>
+              <w:t>-</w:t>
+            </w:r>
           </w:p>
         </w:tc>
       </w:tr>
@@ -14769,7 +16683,6 @@
                 <w:cs/>
                 <w:lang w:bidi="th-TH"/>
               </w:rPr>
-              <w:lastRenderedPageBreak/>
               <w:t>รวม</w:t>
             </w:r>
           </w:p>
@@ -14786,13 +16699,23 @@
           </w:tcPr>
           <w:p>
             <w:pPr>
-              <w:rPr>
-                <w:rFonts w:ascii="TH SarabunPSK" w:hAnsi="TH SarabunPSK" w:cs="TH SarabunPSK"/>
-                <w:sz w:val="32"/>
-                <w:szCs w:val="32"/>
-                <w:lang w:bidi="th-TH"/>
-              </w:rPr>
-            </w:pPr>
+              <w:jc w:val="center"/>
+              <w:rPr>
+                <w:rFonts w:ascii="TH SarabunPSK" w:hAnsi="TH SarabunPSK" w:cs="TH SarabunPSK"/>
+                <w:sz w:val="32"/>
+                <w:szCs w:val="32"/>
+                <w:lang w:bidi="th-TH"/>
+              </w:rPr>
+            </w:pPr>
+            <w:r>
+              <w:rPr>
+                <w:rFonts w:ascii="TH SarabunPSK" w:hAnsi="TH SarabunPSK" w:cs="TH SarabunPSK"/>
+                <w:sz w:val="32"/>
+                <w:szCs w:val="32"/>
+                <w:lang w:bidi="th-TH"/>
+              </w:rPr>
+              <w:t>7</w:t>
+            </w:r>
           </w:p>
         </w:tc>
         <w:tc>
@@ -14807,13 +16730,23 @@
           </w:tcPr>
           <w:p>
             <w:pPr>
-              <w:rPr>
-                <w:rFonts w:ascii="TH SarabunPSK" w:hAnsi="TH SarabunPSK" w:cs="TH SarabunPSK"/>
-                <w:sz w:val="32"/>
-                <w:szCs w:val="32"/>
-                <w:lang w:bidi="th-TH"/>
-              </w:rPr>
-            </w:pPr>
+              <w:jc w:val="center"/>
+              <w:rPr>
+                <w:rFonts w:ascii="TH SarabunPSK" w:hAnsi="TH SarabunPSK" w:cs="TH SarabunPSK"/>
+                <w:sz w:val="32"/>
+                <w:szCs w:val="32"/>
+                <w:lang w:bidi="th-TH"/>
+              </w:rPr>
+            </w:pPr>
+            <w:r>
+              <w:rPr>
+                <w:rFonts w:ascii="TH SarabunPSK" w:hAnsi="TH SarabunPSK" w:cs="TH SarabunPSK"/>
+                <w:sz w:val="32"/>
+                <w:szCs w:val="32"/>
+                <w:lang w:bidi="th-TH"/>
+              </w:rPr>
+              <w:t>6</w:t>
+            </w:r>
           </w:p>
         </w:tc>
         <w:tc>
@@ -14828,13 +16761,23 @@
           </w:tcPr>
           <w:p>
             <w:pPr>
-              <w:rPr>
-                <w:rFonts w:ascii="TH SarabunPSK" w:hAnsi="TH SarabunPSK" w:cs="TH SarabunPSK"/>
-                <w:sz w:val="32"/>
-                <w:szCs w:val="32"/>
-                <w:lang w:bidi="th-TH"/>
-              </w:rPr>
-            </w:pPr>
+              <w:jc w:val="center"/>
+              <w:rPr>
+                <w:rFonts w:ascii="TH SarabunPSK" w:hAnsi="TH SarabunPSK" w:cs="TH SarabunPSK"/>
+                <w:sz w:val="32"/>
+                <w:szCs w:val="32"/>
+                <w:lang w:bidi="th-TH"/>
+              </w:rPr>
+            </w:pPr>
+            <w:r>
+              <w:rPr>
+                <w:rFonts w:ascii="TH SarabunPSK" w:hAnsi="TH SarabunPSK" w:cs="TH SarabunPSK"/>
+                <w:sz w:val="32"/>
+                <w:szCs w:val="32"/>
+                <w:lang w:bidi="th-TH"/>
+              </w:rPr>
+              <w:t>1</w:t>
+            </w:r>
           </w:p>
         </w:tc>
         <w:tc>
@@ -14849,13 +16792,23 @@
           </w:tcPr>
           <w:p>
             <w:pPr>
-              <w:rPr>
-                <w:rFonts w:ascii="TH SarabunPSK" w:hAnsi="TH SarabunPSK" w:cs="TH SarabunPSK"/>
-                <w:sz w:val="32"/>
-                <w:szCs w:val="32"/>
-                <w:lang w:bidi="th-TH"/>
-              </w:rPr>
-            </w:pPr>
+              <w:jc w:val="center"/>
+              <w:rPr>
+                <w:rFonts w:ascii="TH SarabunPSK" w:hAnsi="TH SarabunPSK" w:cs="TH SarabunPSK"/>
+                <w:sz w:val="32"/>
+                <w:szCs w:val="32"/>
+                <w:lang w:bidi="th-TH"/>
+              </w:rPr>
+            </w:pPr>
+            <w:r>
+              <w:rPr>
+                <w:rFonts w:ascii="TH SarabunPSK" w:hAnsi="TH SarabunPSK" w:cs="TH SarabunPSK"/>
+                <w:sz w:val="32"/>
+                <w:szCs w:val="32"/>
+                <w:lang w:bidi="th-TH"/>
+              </w:rPr>
+              <w:t>0</w:t>
+            </w:r>
           </w:p>
         </w:tc>
         <w:tc>
@@ -14870,13 +16823,23 @@
           </w:tcPr>
           <w:p>
             <w:pPr>
-              <w:rPr>
-                <w:rFonts w:ascii="TH SarabunPSK" w:hAnsi="TH SarabunPSK" w:cs="TH SarabunPSK"/>
-                <w:sz w:val="32"/>
-                <w:szCs w:val="32"/>
-                <w:lang w:bidi="th-TH"/>
-              </w:rPr>
-            </w:pPr>
+              <w:jc w:val="center"/>
+              <w:rPr>
+                <w:rFonts w:ascii="TH SarabunPSK" w:hAnsi="TH SarabunPSK" w:cs="TH SarabunPSK"/>
+                <w:sz w:val="32"/>
+                <w:szCs w:val="32"/>
+                <w:lang w:bidi="th-TH"/>
+              </w:rPr>
+            </w:pPr>
+            <w:r>
+              <w:rPr>
+                <w:rFonts w:ascii="TH SarabunPSK" w:hAnsi="TH SarabunPSK" w:cs="TH SarabunPSK"/>
+                <w:sz w:val="32"/>
+                <w:szCs w:val="32"/>
+                <w:lang w:bidi="th-TH"/>
+              </w:rPr>
+              <w:t>0</w:t>
+            </w:r>
           </w:p>
         </w:tc>
         <w:tc>
@@ -17418,11 +19381,11 @@
   <w:style w:type="paragraph" w:default="1" w:styleId="Normal">
     <w:name w:val="Normal"/>
     <w:qFormat/>
+    <w:rsid w:val="00EA760C"/>
   </w:style>
   <w:style w:type="character" w:default="1" w:styleId="DefaultParagraphFont">
     <w:name w:val="Default Paragraph Font"/>
     <w:uiPriority w:val="1"/>
-    <w:semiHidden/>
     <w:unhideWhenUsed/>
   </w:style>
   <w:style w:type="table" w:default="1" w:styleId="TableNormal">

</xml_diff>